<commit_message>
docs: append recent security upgrades and core UX differentiators to secure specifications docx
</commit_message>
<xml_diff>
--- a/RetailMedia_Secure_Specs.docx
+++ b/RetailMedia_Secure_Specs.docx
@@ -652,6 +652,94 @@
           </w:p>
         </w:tc>
       </w:tr>
+      <w:tr>
+        <w:tc>
+          <w:tcPr>
+            <w:tcW w:type="dxa" w:w="4680"/>
+          </w:tcPr>
+          <w:p>
+            <w:r>
+              <w:t>DBマイグレーション起動デッドロック防止＆自動タイムアウト</w:t>
+            </w:r>
+          </w:p>
+        </w:tc>
+        <w:tc>
+          <w:tcPr>
+            <w:tcW w:type="dxa" w:w="4680"/>
+          </w:tcPr>
+          <w:p>
+            <w:r>
+              <w:t>新旧コンテナ起動時のテーブルロック競合（ALTER TABLE等による排他ロック待ち）を排除するため、単一の接続クライアント内で SET lock_timeout = 5000 を強制適用し、万が一のタイムアウト時もエラーをキャッチして起動を継続する、極めて耐障害性の高いマイグレーション設計を導入。</w:t>
+            </w:r>
+          </w:p>
+        </w:tc>
+      </w:tr>
+      <w:tr>
+        <w:tc>
+          <w:tcPr>
+            <w:tcW w:type="dxa" w:w="4680"/>
+          </w:tcPr>
+          <w:p>
+            <w:r>
+              <w:t>クロスロール2FA（二段階認証）の動的同期</w:t>
+            </w:r>
+          </w:p>
+        </w:tc>
+        <w:tc>
+          <w:tcPr>
+            <w:tcW w:type="dxa" w:w="4680"/>
+          </w:tcPr>
+          <w:p>
+            <w:r>
+              <w:t>同一メールアドレスで「店舗」や「広告主」など複数のロールを持つユーザーが、一方のロールで2FAを有効化した場合、もう一方のロールログイン時にも2FAシークレットをデータベース上で自動同期・強制適用。ユーザーの利便性を損なわずにシステム全体の安全性を担保。</w:t>
+            </w:r>
+          </w:p>
+        </w:tc>
+      </w:tr>
+      <w:tr>
+        <w:tc>
+          <w:tcPr>
+            <w:tcW w:type="dxa" w:w="4680"/>
+          </w:tcPr>
+          <w:p>
+            <w:r>
+              <w:t>添付ファイルの安全なデコード保存とXSSの徹底排除</w:t>
+            </w:r>
+          </w:p>
+        </w:tc>
+        <w:tc>
+          <w:tcPr>
+            <w:tcW w:type="dxa" w:w="4680"/>
+          </w:tcPr>
+          <w:p>
+            <w:r>
+              <w:t>お問い合わせフォーム等から送信された添付画像（Base64）データをサーバー側で安全にバイナリデコードしてディスク（uploads/contacts/）に隔離保存。管理者画面での受信一覧の表示時には、エスケープ処理（escapeHtml）を適用した上で安全なレンダリングを行い、XSS（クロスサイトスクリプティング）を完全に無害化。</w:t>
+            </w:r>
+          </w:p>
+        </w:tc>
+      </w:tr>
+      <w:tr>
+        <w:tc>
+          <w:tcPr>
+            <w:tcW w:type="dxa" w:w="4680"/>
+          </w:tcPr>
+          <w:p>
+            <w:r>
+              <w:t>CORSおよびミドルウェアの適用漏れ自動防御</w:t>
+            </w:r>
+          </w:p>
+        </w:tc>
+        <w:tc>
+          <w:tcPr>
+            <w:tcW w:type="dxa" w:w="4680"/>
+          </w:tcPr>
+          <w:p>
+            <w:r>
+              <w:t>CORSブロックによる通信切断を防ぐため、すべてのルートハンドラよりも上部で Express CORS ミドルウェアを一律に適用し、Credentialsが不要なセッションではOrigin「*」を許容しつつ、トークンによる認証を並行して機能させることで、ブラウザ側のCORS拒否を完全に回避。</w:t>
+            </w:r>
+          </w:p>
+        </w:tc>
+      </w:tr>
     </w:tbl>
     <w:p>
       <w:pPr>
@@ -833,6 +921,61 @@
           <w:sz w:val="22"/>
         </w:rPr>
         <w:t>Gitプッシュ直前の「git diff」による、機密情報（APIキー等）や不要な一時設定ファイルのハードコード混入チェックの徹底。</w:t>
+      </w:r>
+    </w:p>
+    <w:p/>
+    <w:p>
+      <w:pPr>
+        <w:pStyle w:val="Heading1"/>
+      </w:pPr>
+      <w:r>
+        <w:t>6. 他システムとの差別化要素（セキュアUX ＆ 高レジリエンス設計）</w:t>
+      </w:r>
+    </w:p>
+    <w:p>
+      <w:r>
+        <w:rPr>
+          <w:i/>
+        </w:rPr>
+        <w:t>本システムが他社の標準的なリテールメディア・アドプラットフォームと差別化される、セキュリティおよびUXを両立させたコア設計仕様です。</w:t>
+        <w:br/>
+        <w:br/>
+      </w:r>
+    </w:p>
+    <w:p>
+      <w:r>
+        <w:rPr>
+          <w:b/>
+        </w:rPr>
+        <w:t>■ シームレスな自動復帰（Remember-Me &amp; Smart Redirect）仕様</w:t>
+        <w:br/>
+      </w:r>
+      <w:r>
+        <w:t>ログイン成功時にのみ、LocalStorageへ遷移先URL（last_active_service）および認証情報を保存し、ログアウト時でもこれらを維持します。次回起動（index.htmlアクセス）時に、過去に開いていた適切なログイン画面へ自動リダイレクトと認証情報の自動入力を行うことで、二重ログイン等の状態不整合（セッション混同）を防ぎつつ、極めてシームレスなUXをユーザーに提供します。</w:t>
+      </w:r>
+    </w:p>
+    <w:p>
+      <w:r>
+        <w:rPr>
+          <w:b/>
+        </w:rPr>
+        <w:t>■ 外部AI APIの動的フォールバックと完全デモ保証（ハイブリッド・レジリエンス）</w:t>
+        <w:br/>
+      </w:r>
+      <w:r>
+        <w:t>Google Gemini等の外部生成AI APIを使用する際、単一のモデルに依存せず、優先度の高いモデル（gemini-2.5-flash, gemini-1.5-flash等）をリスト化して自動で切り替えるモデルフォールバック機構を搭載。さらに、通信障害時やAPIキー未設定時でも、事前に定義されたデモ用データを返却してフロントエンドをクラッシュさせずに処理を継続する、他社にない高耐久性を実現しています。</w:t>
+      </w:r>
+    </w:p>
+    <w:p>
+      <w:r>
+        <w:rPr>
+          <w:b/>
+        </w:rPr>
+        <w:t>■ ローカル・本番のハイブリッド実行環境（DB動的ローテーション）</w:t>
+        <w:br/>
+      </w:r>
+      <w:r>
+        <w:t>本番のクラウド環境（RDS PostgreSQL）と、ローカル開発環境（SQLite）を環境変数（DATABASE_URL）の有無によって動的に判別。本番環境で不要なバイナリ（sqlite3等）のロードによるクラッシュ（ERR_DLOPEN_FAILED）を完全に防止するとともに、database.jsonとPostgreSQL/SQLite間のデータ自動マイグレーションを起動時に実行する、運用安全性の高いインフラ構成を構築しています。</w:t>
       </w:r>
     </w:p>
     <w:sectPr>

</xml_diff>

<commit_message>
fix & docs: completely remove database.json automatic migration sync from both code and specification docx as it is obsolete
</commit_message>
<xml_diff>
--- a/RetailMedia_Secure_Specs.docx
+++ b/RetailMedia_Secure_Specs.docx
@@ -968,14 +968,9 @@
     </w:p>
     <w:p>
       <w:r>
-        <w:rPr>
-          <w:b/>
-        </w:rPr>
         <w:t>■ ローカル・本番のハイブリッド実行環境（DB動的ローテーション）</w:t>
         <w:br/>
-      </w:r>
-      <w:r>
-        <w:t>本番のクラウド環境（RDS PostgreSQL）と、ローカル開発環境（SQLite）を環境変数（DATABASE_URL）の有無によって動的に判別。本番環境で不要なバイナリ（sqlite3等）のロードによるクラッシュ（ERR_DLOPEN_FAILED）を完全に防止するとともに、database.jsonとPostgreSQL/SQLite間のデータ自動マイグレーションを起動時に実行する、運用安全性の高いインフラ構成を構築しています。</w:t>
+        <w:t>本番のクラウド環境（RDS PostgreSQL）と、ローカル開発環境（SQLite）を環境変数（DATABASE_URL）の有無によって動的に判別。本番環境で不要なバイナリ（sqlite3等）のロードによるクラッシュ（ERR_DLOPEN_FAILED）を完全に防止するとともに、インメモリJSONへの依存を完全に排除し、堅牢なリレーショナルDBへの直接SQL参照設計で動作する、運用安全性の高いインフラ構成を構築しています。</w:t>
       </w:r>
     </w:p>
     <w:sectPr>

</xml_diff>

<commit_message>
Update security specifications to enforce 2FA and strict account banning
</commit_message>
<xml_diff>
--- a/RetailMedia_Secure_Specs.docx
+++ b/RetailMedia_Secure_Specs.docx
@@ -554,12 +554,7 @@
           </w:tcPr>
           <w:p>
             <w:r>
-              <w:rPr>
-                <w:rFonts w:ascii="MS Gothic" w:hAnsi="MS Gothic"/>
-                <w:b w:val="0"/>
-                <w:sz w:val="20"/>
-              </w:rPr>
-              <w:t>AI音声スタジオ等において、詐欺・闇バイト・還付金詐欺などの禁止ワードが入力された場合、API側で即時に検知し、一撃でアカウントストライクを3（最大値）に設定して即時アカウントロック（BAN）をかけるとともに永続化します。</w:t>
+              <w:t>AI音声スタジオでの禁止ワード（詐欺・闇バイト・還付金詐欺等）入力時、またはAI広告自動審査での規約違反検知時、段階的な警告や猶予を与えず、一発アウトで即時にアカウントストライクを3（最大値）に設定して即座にアカウントロック（BAN）をかけ、永続的に保存します。</w:t>
             </w:r>
           </w:p>
         </w:tc>
@@ -973,6 +968,28 @@
         <w:t>本番のクラウド環境（RDS PostgreSQL）と、ローカル開発環境（SQLite）を環境変数（DATABASE_URL）の有無によって動的に判別。本番環境で不要なバイナリ（sqlite3等）のロードによるクラッシュ（ERR_DLOPEN_FAILED）を完全に防止するとともに、インメモリJSONへの依存を完全に排除し、堅牢なリレーショナルDBへの直接SQL参照設計で動作する、運用安全性の高いインフラ構成を構築しています。</w:t>
       </w:r>
     </w:p>
+    <w:p>
+      <w:r>
+        <w:br/>
+        <w:t>■ 店舗住所情報に基づく配信対象エリアの自動判別と広告マッチング仕様</w:t>
+      </w:r>
+    </w:p>
+    <w:p>
+      <w:r>
+        <w:t>店舗オーナー（store）のプロフィール設定画面に「住所」および「店舗業態セグメント」の入力機能を追加。入力された住所情報をバックエンド側で自動的にパースし、都道府県および対応する配信エリア（関東、関西等）を自動判定してデータベースおよびS3に永続保存します。これにより、広告主（advertiser）が指定したエリア・都道府県・業態フィルタリング条件と完全一致する広告のみをサイネージに配信するリアルタイムマッチングを実現しています。</w:t>
+      </w:r>
+    </w:p>
+    <w:p>
+      <w:r>
+        <w:br/>
+        <w:t>■ ストア・リテーラー共通ポータルの導線適正化と強制ログイン仕様</w:t>
+      </w:r>
+    </w:p>
+    <w:p>
+      <w:r>
+        <w:t>広告主ダッシュボードからの不要なリテーラー遷移リンクを廃止し、店舗ポータル（store_portal）の最近のトランザクションカード下にリンクを適正配置。クリック時は直接遷移させず、ログイン画面（index.html?role=store）を最優先で経由させ、安全な認証手続きを強制したうえでポータルへと導くセキュアな動線制御を徹底しています。</w:t>
+      </w:r>
+    </w:p>
     <w:sectPr>
       <w:pgSz w:w="12240" w:h="15840"/>
       <w:pgMar w:top="1440" w:right="1440" w:bottom="1440" w:left="1440" w:header="720" w:footer="720" w:gutter="0"/>

</xml_diff>

<commit_message>
Revert campaign moderation strike logic and spec back to 3-strikes progressive rule
</commit_message>
<xml_diff>
--- a/RetailMedia_Secure_Specs.docx
+++ b/RetailMedia_Secure_Specs.docx
@@ -533,12 +533,7 @@
           </w:tcPr>
           <w:p>
             <w:r>
-              <w:rPr>
-                <w:rFonts w:ascii="MS Gothic" w:hAnsi="MS Gothic"/>
-                <w:b/>
-                <w:sz w:val="20"/>
-              </w:rPr>
-              <w:t>AI Content Moderation (即時アカウント凍結)</w:t>
+              <w:t>AI Content Moderation (アカウント凍結)</w:t>
             </w:r>
           </w:p>
         </w:tc>
@@ -554,7 +549,7 @@
           </w:tcPr>
           <w:p>
             <w:r>
-              <w:t>AI音声スタジオでの禁止ワード（詐欺・闇バイト・還付金詐欺等）入力時、またはAI広告自動審査での規約違反検知時、段階的な警告や猶予を与えず、一発アウトで即時にアカウントストライクを3（最大値）に設定して即座にアカウントロック（BAN）をかけ、永続的に保存します。</w:t>
+              <w:t>AI音声スタジオでの禁止ワード入力時、またはAI広告自動審査での規約違反検知時、アカウントストライクを加算（警告）し、累積3ストライクに達した時点でアカウントを即座にロック（BAN）します。</w:t>
             </w:r>
           </w:p>
         </w:tc>

</xml_diff>

<commit_message>
Optimize document paragraph merging and line spacing format
</commit_message>
<xml_diff>
--- a/RetailMedia_Secure_Specs.docx
+++ b/RetailMedia_Secure_Specs.docx
@@ -4,46 +4,13 @@
   <w:body>
     <w:p>
       <w:pPr>
+        <w:spacing w:before="0" w:after="40" w:line="264" w:lineRule="auto"/>
         <w:jc w:val="center"/>
       </w:pPr>
       <w:r>
-        <w:rPr>
-          <w:rFonts w:ascii="MS Gothic" w:hAnsi="MS Gothic"/>
-          <w:b/>
-          <w:color w:val="1A5276"/>
-          <w:sz w:val="48"/>
-        </w:rPr>
         <w:t>リテアド (RetailMedia-ad)</w:t>
         <w:br/>
-        <w:t>システム要件 ＆ セキュリティ設計仕様書</w:t>
-      </w:r>
-    </w:p>
-    <w:p>
-      <w:pPr>
-        <w:jc w:val="center"/>
-      </w:pPr>
-      <w:r>
-        <w:rPr>
-          <w:rFonts w:ascii="MS Gothic" w:hAnsi="MS Gothic"/>
-          <w:i/>
-          <w:color w:val="7F8C8D"/>
-          <w:sz w:val="28"/>
-        </w:rPr>
-        <w:br/>
-        <w:t>— 開発・エンジニアリング部門向け技術共有資料 —</w:t>
-      </w:r>
-    </w:p>
-    <w:p>
-      <w:pPr>
-        <w:spacing w:before="3000"/>
-        <w:jc w:val="right"/>
-      </w:pPr>
-      <w:r>
-        <w:rPr>
-          <w:rFonts w:ascii="MS Gothic" w:hAnsi="MS Gothic"/>
-          <w:sz w:val="21"/>
-        </w:rPr>
-        <w:t>作成日: 2026年6月19日</w:t>
+        <w:t>システム要件 ＆ セキュリティ設計仕様書— 開発・エンジニアリング部門向け技術共有資料 —作成日: 2026年6月19日</w:t>
         <w:br/>
         <w:t>バージョン: 1.0.0 (改訂版)</w:t>
         <w:br/>
@@ -53,6 +20,9 @@
       </w:r>
     </w:p>
     <w:p>
+      <w:pPr>
+        <w:spacing w:before="0" w:after="40" w:line="264" w:lineRule="auto"/>
+      </w:pPr>
       <w:r>
         <w:br w:type="page"/>
       </w:r>
@@ -60,7 +30,7 @@
     <w:p>
       <w:pPr>
         <w:pStyle w:val="Heading1"/>
-        <w:spacing w:before="240" w:after="120"/>
+        <w:spacing w:before="0" w:after="40" w:line="264" w:lineRule="auto"/>
       </w:pPr>
       <w:r>
         <w:rPr>
@@ -74,7 +44,7 @@
     </w:p>
     <w:p>
       <w:pPr>
-        <w:spacing w:line="300" w:lineRule="auto" w:after="240"/>
+        <w:spacing w:line="264" w:lineRule="auto" w:after="40" w:before="0"/>
       </w:pPr>
       <w:r>
         <w:rPr>
@@ -90,7 +60,7 @@
     <w:p>
       <w:pPr>
         <w:pStyle w:val="Heading1"/>
-        <w:spacing w:before="240" w:after="120"/>
+        <w:spacing w:before="0" w:after="40" w:line="264" w:lineRule="auto"/>
       </w:pPr>
       <w:r>
         <w:rPr>
@@ -104,7 +74,7 @@
     </w:p>
     <w:p>
       <w:pPr>
-        <w:spacing w:after="120"/>
+        <w:spacing w:after="40" w:before="0" w:line="264" w:lineRule="auto"/>
       </w:pPr>
       <w:r>
         <w:rPr>
@@ -118,7 +88,7 @@
     <w:p>
       <w:pPr>
         <w:pStyle w:val="ListBullet"/>
-        <w:spacing w:after="80"/>
+        <w:spacing w:after="40" w:before="0" w:line="264" w:lineRule="auto"/>
       </w:pPr>
       <w:r>
         <w:rPr>
@@ -140,7 +110,7 @@
     <w:p>
       <w:pPr>
         <w:pStyle w:val="ListBullet"/>
-        <w:spacing w:after="80"/>
+        <w:spacing w:after="40" w:before="0" w:line="264" w:lineRule="auto"/>
       </w:pPr>
       <w:r>
         <w:rPr>
@@ -162,7 +132,7 @@
     <w:p>
       <w:pPr>
         <w:pStyle w:val="ListBullet"/>
-        <w:spacing w:after="80"/>
+        <w:spacing w:after="40" w:before="0" w:line="264" w:lineRule="auto"/>
       </w:pPr>
       <w:r>
         <w:rPr>
@@ -184,7 +154,7 @@
     <w:p>
       <w:pPr>
         <w:pStyle w:val="ListBullet"/>
-        <w:spacing w:after="80"/>
+        <w:spacing w:after="40" w:before="0" w:line="264" w:lineRule="auto"/>
       </w:pPr>
       <w:r>
         <w:rPr>
@@ -206,7 +176,7 @@
     <w:p>
       <w:pPr>
         <w:pStyle w:val="ListBullet"/>
-        <w:spacing w:after="80"/>
+        <w:spacing w:after="40" w:before="0" w:line="264" w:lineRule="auto"/>
       </w:pPr>
       <w:r>
         <w:rPr>
@@ -228,7 +198,7 @@
     <w:p>
       <w:pPr>
         <w:pStyle w:val="ListBullet"/>
-        <w:spacing w:after="80"/>
+        <w:spacing w:after="40" w:before="0" w:line="264" w:lineRule="auto"/>
       </w:pPr>
       <w:r>
         <w:rPr>
@@ -249,13 +219,13 @@
     </w:p>
     <w:p>
       <w:pPr>
-        <w:spacing w:after="120"/>
+        <w:spacing w:after="40" w:before="0" w:line="264" w:lineRule="auto"/>
       </w:pPr>
     </w:p>
     <w:p>
       <w:pPr>
         <w:pStyle w:val="Heading1"/>
-        <w:spacing w:before="240" w:after="120"/>
+        <w:spacing w:before="0" w:after="40" w:line="264" w:lineRule="auto"/>
       </w:pPr>
       <w:r>
         <w:rPr>
@@ -269,7 +239,7 @@
     </w:p>
     <w:p>
       <w:pPr>
-        <w:spacing w:after="120"/>
+        <w:spacing w:after="40" w:before="0" w:line="264" w:lineRule="auto"/>
       </w:pPr>
       <w:r>
         <w:rPr>
@@ -304,6 +274,7 @@
           </w:tcPr>
           <w:p>
             <w:pPr>
+              <w:spacing w:before="0" w:after="20" w:line="252" w:lineRule="auto"/>
               <w:jc w:val="center"/>
             </w:pPr>
             <w:r>
@@ -330,6 +301,7 @@
           </w:tcPr>
           <w:p>
             <w:pPr>
+              <w:spacing w:before="0" w:after="20" w:line="252" w:lineRule="auto"/>
               <w:jc w:val="center"/>
             </w:pPr>
             <w:r>
@@ -356,6 +328,9 @@
             </w:tcMar>
           </w:tcPr>
           <w:p>
+            <w:pPr>
+              <w:spacing w:before="0" w:after="20" w:line="252" w:lineRule="auto"/>
+            </w:pPr>
             <w:r>
               <w:rPr>
                 <w:rFonts w:ascii="MS Gothic" w:hAnsi="MS Gothic"/>
@@ -377,6 +352,9 @@
             </w:tcMar>
           </w:tcPr>
           <w:p>
+            <w:pPr>
+              <w:spacing w:before="0" w:after="20" w:line="252" w:lineRule="auto"/>
+            </w:pPr>
             <w:r>
               <w:rPr>
                 <w:rFonts w:ascii="MS Gothic" w:hAnsi="MS Gothic"/>
@@ -400,6 +378,9 @@
             </w:tcMar>
           </w:tcPr>
           <w:p>
+            <w:pPr>
+              <w:spacing w:before="0" w:after="20" w:line="252" w:lineRule="auto"/>
+            </w:pPr>
             <w:r>
               <w:rPr>
                 <w:rFonts w:ascii="MS Gothic" w:hAnsi="MS Gothic"/>
@@ -421,6 +402,9 @@
             </w:tcMar>
           </w:tcPr>
           <w:p>
+            <w:pPr>
+              <w:spacing w:before="0" w:after="20" w:line="252" w:lineRule="auto"/>
+            </w:pPr>
             <w:r>
               <w:rPr>
                 <w:rFonts w:ascii="MS Gothic" w:hAnsi="MS Gothic"/>
@@ -444,6 +428,9 @@
             </w:tcMar>
           </w:tcPr>
           <w:p>
+            <w:pPr>
+              <w:spacing w:before="0" w:after="20" w:line="252" w:lineRule="auto"/>
+            </w:pPr>
             <w:r>
               <w:rPr>
                 <w:rFonts w:ascii="MS Gothic" w:hAnsi="MS Gothic"/>
@@ -465,6 +452,9 @@
             </w:tcMar>
           </w:tcPr>
           <w:p>
+            <w:pPr>
+              <w:spacing w:before="0" w:after="20" w:line="252" w:lineRule="auto"/>
+            </w:pPr>
             <w:r>
               <w:rPr>
                 <w:rFonts w:ascii="MS Gothic" w:hAnsi="MS Gothic"/>
@@ -488,6 +478,9 @@
             </w:tcMar>
           </w:tcPr>
           <w:p>
+            <w:pPr>
+              <w:spacing w:before="0" w:after="20" w:line="252" w:lineRule="auto"/>
+            </w:pPr>
             <w:r>
               <w:rPr>
                 <w:rFonts w:ascii="MS Gothic" w:hAnsi="MS Gothic"/>
@@ -509,6 +502,9 @@
             </w:tcMar>
           </w:tcPr>
           <w:p>
+            <w:pPr>
+              <w:spacing w:before="0" w:after="20" w:line="252" w:lineRule="auto"/>
+            </w:pPr>
             <w:r>
               <w:rPr>
                 <w:rFonts w:ascii="MS Gothic" w:hAnsi="MS Gothic"/>
@@ -532,6 +528,9 @@
             </w:tcMar>
           </w:tcPr>
           <w:p>
+            <w:pPr>
+              <w:spacing w:before="0" w:after="20" w:line="252" w:lineRule="auto"/>
+            </w:pPr>
             <w:r>
               <w:t>AI Content Moderation (アカウント凍結)</w:t>
             </w:r>
@@ -548,6 +547,9 @@
             </w:tcMar>
           </w:tcPr>
           <w:p>
+            <w:pPr>
+              <w:spacing w:before="0" w:after="20" w:line="252" w:lineRule="auto"/>
+            </w:pPr>
             <w:r>
               <w:t>AI音声スタジオでの禁止ワード入力時、またはAI広告自動審査での規約違反検知時、アカウントストライクを加算（警告）し、累積3ストライクに達した時点でアカウントを即座にロック（BAN）します。</w:t>
             </w:r>
@@ -566,6 +568,9 @@
             </w:tcMar>
           </w:tcPr>
           <w:p>
+            <w:pPr>
+              <w:spacing w:before="0" w:after="20" w:line="252" w:lineRule="auto"/>
+            </w:pPr>
             <w:r>
               <w:rPr>
                 <w:rFonts w:ascii="MS Gothic" w:hAnsi="MS Gothic"/>
@@ -587,6 +592,9 @@
             </w:tcMar>
           </w:tcPr>
           <w:p>
+            <w:pPr>
+              <w:spacing w:before="0" w:after="20" w:line="252" w:lineRule="auto"/>
+            </w:pPr>
             <w:r>
               <w:rPr>
                 <w:rFonts w:ascii="MS Gothic" w:hAnsi="MS Gothic"/>
@@ -610,6 +618,9 @@
             </w:tcMar>
           </w:tcPr>
           <w:p>
+            <w:pPr>
+              <w:spacing w:before="0" w:after="20" w:line="252" w:lineRule="auto"/>
+            </w:pPr>
             <w:r>
               <w:rPr>
                 <w:rFonts w:ascii="MS Gothic" w:hAnsi="MS Gothic"/>
@@ -631,6 +642,9 @@
             </w:tcMar>
           </w:tcPr>
           <w:p>
+            <w:pPr>
+              <w:spacing w:before="0" w:after="20" w:line="252" w:lineRule="auto"/>
+            </w:pPr>
             <w:r>
               <w:rPr>
                 <w:rFonts w:ascii="MS Gothic" w:hAnsi="MS Gothic"/>
@@ -648,6 +662,9 @@
             <w:tcW w:type="dxa" w:w="4680"/>
           </w:tcPr>
           <w:p>
+            <w:pPr>
+              <w:spacing w:before="0" w:after="20" w:line="252" w:lineRule="auto"/>
+            </w:pPr>
             <w:r>
               <w:t>DBマイグレーション起動デッドロック防止＆自動タイムアウト</w:t>
             </w:r>
@@ -658,6 +675,9 @@
             <w:tcW w:type="dxa" w:w="4680"/>
           </w:tcPr>
           <w:p>
+            <w:pPr>
+              <w:spacing w:before="0" w:after="20" w:line="252" w:lineRule="auto"/>
+            </w:pPr>
             <w:r>
               <w:t>新旧コンテナ起動時のテーブルロック競合（ALTER TABLE等による排他ロック待ち）を排除するため、単一の接続クライアント内で SET lock_timeout = 5000 を強制適用し、万が一のタイムアウト時もエラーをキャッチして起動を継続する、極めて耐障害性の高いマイグレーション設計を導入。</w:t>
             </w:r>
@@ -670,6 +690,9 @@
             <w:tcW w:type="dxa" w:w="4680"/>
           </w:tcPr>
           <w:p>
+            <w:pPr>
+              <w:spacing w:before="0" w:after="20" w:line="252" w:lineRule="auto"/>
+            </w:pPr>
             <w:r>
               <w:t>クロスロール2FA（二段階認証）の動的同期</w:t>
             </w:r>
@@ -680,6 +703,9 @@
             <w:tcW w:type="dxa" w:w="4680"/>
           </w:tcPr>
           <w:p>
+            <w:pPr>
+              <w:spacing w:before="0" w:after="20" w:line="252" w:lineRule="auto"/>
+            </w:pPr>
             <w:r>
               <w:t>同一メールアドレスで「店舗」や「広告主」など複数のロールを持つユーザーが、一方のロールで2FAを有効化した場合、もう一方のロールログイン時にも2FAシークレットをデータベース上で自動同期・強制適用。ユーザーの利便性を損なわずにシステム全体の安全性を担保。</w:t>
             </w:r>
@@ -692,6 +718,9 @@
             <w:tcW w:type="dxa" w:w="4680"/>
           </w:tcPr>
           <w:p>
+            <w:pPr>
+              <w:spacing w:before="0" w:after="20" w:line="252" w:lineRule="auto"/>
+            </w:pPr>
             <w:r>
               <w:t>添付ファイルの安全なデコード保存とXSSの徹底排除</w:t>
             </w:r>
@@ -702,6 +731,9 @@
             <w:tcW w:type="dxa" w:w="4680"/>
           </w:tcPr>
           <w:p>
+            <w:pPr>
+              <w:spacing w:before="0" w:after="20" w:line="252" w:lineRule="auto"/>
+            </w:pPr>
             <w:r>
               <w:t>お問い合わせフォーム等から送信された添付画像（Base64）データをサーバー側で安全にバイナリデコードしてディスク（uploads/contacts/）に隔離保存。管理者画面での受信一覧の表示時には、エスケープ処理（escapeHtml）を適用した上で安全なレンダリングを行い、XSS（クロスサイトスクリプティング）を完全に無害化。</w:t>
             </w:r>
@@ -714,6 +746,9 @@
             <w:tcW w:type="dxa" w:w="4680"/>
           </w:tcPr>
           <w:p>
+            <w:pPr>
+              <w:spacing w:before="0" w:after="20" w:line="252" w:lineRule="auto"/>
+            </w:pPr>
             <w:r>
               <w:t>CORSおよびミドルウェアの適用漏れ自動防御</w:t>
             </w:r>
@@ -724,6 +759,9 @@
             <w:tcW w:type="dxa" w:w="4680"/>
           </w:tcPr>
           <w:p>
+            <w:pPr>
+              <w:spacing w:before="0" w:after="20" w:line="252" w:lineRule="auto"/>
+            </w:pPr>
             <w:r>
               <w:t>CORSブロックによる通信切断を防ぐため、すべてのルートハンドラよりも上部で Express CORS ミドルウェアを一律に適用し、Credentialsが不要なセッションではOrigin「*」を許容しつつ、トークンによる認証を並行して機能させることで、ブラウザ側のCORS拒否を完全に回避。</w:t>
             </w:r>
@@ -733,13 +771,13 @@
     </w:tbl>
     <w:p>
       <w:pPr>
-        <w:spacing w:after="240"/>
+        <w:spacing w:after="40" w:before="0" w:line="264" w:lineRule="auto"/>
       </w:pPr>
     </w:p>
     <w:p>
       <w:pPr>
         <w:pStyle w:val="Heading1"/>
-        <w:spacing w:before="240" w:after="120"/>
+        <w:spacing w:before="0" w:after="40" w:line="264" w:lineRule="auto"/>
       </w:pPr>
       <w:r>
         <w:rPr>
@@ -753,7 +791,7 @@
     </w:p>
     <w:p>
       <w:pPr>
-        <w:spacing w:line="300" w:lineRule="auto" w:after="200"/>
+        <w:spacing w:line="264" w:lineRule="auto" w:after="40" w:before="0"/>
       </w:pPr>
       <w:r>
         <w:rPr>
@@ -768,7 +806,7 @@
     </w:p>
     <w:p>
       <w:pPr>
-        <w:spacing w:after="160"/>
+        <w:spacing w:after="40" w:before="0" w:line="264" w:lineRule="auto"/>
         <w:ind w:left="288"/>
       </w:pPr>
       <w:r>
@@ -792,7 +830,7 @@
     </w:p>
     <w:p>
       <w:pPr>
-        <w:spacing w:after="160"/>
+        <w:spacing w:after="40" w:before="0" w:line="264" w:lineRule="auto"/>
         <w:ind w:left="288"/>
       </w:pPr>
       <w:r>
@@ -816,7 +854,7 @@
     </w:p>
     <w:p>
       <w:pPr>
-        <w:spacing w:after="160"/>
+        <w:spacing w:after="40" w:before="0" w:line="264" w:lineRule="auto"/>
         <w:ind w:left="288"/>
       </w:pPr>
       <w:r>
@@ -840,13 +878,13 @@
     </w:p>
     <w:p>
       <w:pPr>
-        <w:spacing w:after="240"/>
+        <w:spacing w:after="40" w:before="0" w:line="264" w:lineRule="auto"/>
       </w:pPr>
     </w:p>
     <w:p>
       <w:pPr>
         <w:pStyle w:val="Heading1"/>
-        <w:spacing w:before="240" w:after="120"/>
+        <w:spacing w:before="0" w:after="40" w:line="264" w:lineRule="auto"/>
       </w:pPr>
       <w:r>
         <w:rPr>
@@ -860,7 +898,7 @@
     </w:p>
     <w:p>
       <w:pPr>
-        <w:spacing w:line="300" w:lineRule="auto" w:after="200"/>
+        <w:spacing w:line="264" w:lineRule="auto" w:after="40" w:before="0"/>
       </w:pPr>
       <w:r>
         <w:rPr>
@@ -874,7 +912,7 @@
     <w:p>
       <w:pPr>
         <w:pStyle w:val="ListBullet"/>
-        <w:spacing w:after="80"/>
+        <w:spacing w:after="40" w:before="0" w:line="264" w:lineRule="auto"/>
       </w:pPr>
       <w:r>
         <w:rPr>
@@ -888,7 +926,7 @@
     <w:p>
       <w:pPr>
         <w:pStyle w:val="ListBullet"/>
-        <w:spacing w:after="80"/>
+        <w:spacing w:after="40" w:before="0" w:line="264" w:lineRule="auto"/>
       </w:pPr>
       <w:r>
         <w:rPr>
@@ -902,7 +940,7 @@
     <w:p>
       <w:pPr>
         <w:pStyle w:val="ListBullet"/>
-        <w:spacing w:after="80"/>
+        <w:spacing w:after="40" w:before="0" w:line="264" w:lineRule="auto"/>
       </w:pPr>
       <w:r>
         <w:rPr>
@@ -913,16 +951,24 @@
         <w:t>Gitプッシュ直前の「git diff」による、機密情報（APIキー等）や不要な一時設定ファイルのハードコード混入チェックの徹底。</w:t>
       </w:r>
     </w:p>
-    <w:p/>
+    <w:p>
+      <w:pPr>
+        <w:spacing w:before="0" w:after="40" w:line="264" w:lineRule="auto"/>
+      </w:pPr>
+    </w:p>
     <w:p>
       <w:pPr>
         <w:pStyle w:val="Heading1"/>
+        <w:spacing w:before="0" w:after="40" w:line="264" w:lineRule="auto"/>
       </w:pPr>
       <w:r>
         <w:t>6. 他システムとの差別化要素（セキュアUX ＆ 高レジリエンス設計）</w:t>
       </w:r>
     </w:p>
     <w:p>
+      <w:pPr>
+        <w:spacing w:before="0" w:after="40" w:line="264" w:lineRule="auto"/>
+      </w:pPr>
       <w:r>
         <w:rPr>
           <w:i/>
@@ -933,6 +979,9 @@
       </w:r>
     </w:p>
     <w:p>
+      <w:pPr>
+        <w:spacing w:before="0" w:after="40" w:line="264" w:lineRule="auto"/>
+      </w:pPr>
       <w:r>
         <w:rPr>
           <w:b/>
@@ -945,6 +994,9 @@
       </w:r>
     </w:p>
     <w:p>
+      <w:pPr>
+        <w:spacing w:before="0" w:after="40" w:line="264" w:lineRule="auto"/>
+      </w:pPr>
       <w:r>
         <w:rPr>
           <w:b/>
@@ -957,6 +1009,9 @@
       </w:r>
     </w:p>
     <w:p>
+      <w:pPr>
+        <w:spacing w:before="0" w:after="40" w:line="264" w:lineRule="auto"/>
+      </w:pPr>
       <w:r>
         <w:t>■ ローカル・本番のハイブリッド実行環境（DB動的ローテーション）</w:t>
         <w:br/>
@@ -964,23 +1019,35 @@
       </w:r>
     </w:p>
     <w:p>
+      <w:pPr>
+        <w:spacing w:before="0" w:after="40" w:line="264" w:lineRule="auto"/>
+      </w:pPr>
       <w:r>
         <w:br/>
         <w:t>■ 店舗住所情報に基づく配信対象エリアの自動判別と広告マッチング仕様</w:t>
       </w:r>
     </w:p>
     <w:p>
+      <w:pPr>
+        <w:spacing w:before="0" w:after="40" w:line="264" w:lineRule="auto"/>
+      </w:pPr>
       <w:r>
         <w:t>店舗オーナー（store）のプロフィール設定画面に「住所」および「店舗業態セグメント」の入力機能を追加。入力された住所情報をバックエンド側で自動的にパースし、都道府県および対応する配信エリア（関東、関西等）を自動判定してデータベースおよびS3に永続保存します。これにより、広告主（advertiser）が指定したエリア・都道府県・業態フィルタリング条件と完全一致する広告のみをサイネージに配信するリアルタイムマッチングを実現しています。</w:t>
       </w:r>
     </w:p>
     <w:p>
+      <w:pPr>
+        <w:spacing w:before="0" w:after="40" w:line="264" w:lineRule="auto"/>
+      </w:pPr>
       <w:r>
         <w:br/>
         <w:t>■ ストア・リテーラー共通ポータルの導線適正化と強制ログイン仕様</w:t>
       </w:r>
     </w:p>
     <w:p>
+      <w:pPr>
+        <w:spacing w:before="0" w:after="40" w:line="264" w:lineRule="auto"/>
+      </w:pPr>
       <w:r>
         <w:t>広告主ダッシュボードからの不要なリテーラー遷移リンクを廃止し、店舗ポータル（store_portal）の最近のトランザクションカード下にリンクを適正配置。クリック時は直接遷移させず、ログイン画面（index.html?role=store）を最優先で経由させ、安全な認証手続きを強制したうえでポータルへと導くセキュアな動線制御を徹底しています。</w:t>
       </w:r>

</xml_diff>

<commit_message>
Optimize document layout by restoring paragraph breaks and applying proper space_before/after margins
</commit_message>
<xml_diff>
--- a/RetailMedia_Secure_Specs.docx
+++ b/RetailMedia_Secure_Specs.docx
@@ -4,13 +4,48 @@
   <w:body>
     <w:p>
       <w:pPr>
-        <w:spacing w:before="0" w:after="40" w:line="264" w:lineRule="auto"/>
+        <w:spacing w:before="280" w:after="120" w:line="288" w:lineRule="auto"/>
         <w:jc w:val="center"/>
       </w:pPr>
       <w:r>
+        <w:rPr>
+          <w:rFonts w:ascii="MS Gothic" w:hAnsi="MS Gothic"/>
+          <w:b/>
+          <w:color w:val="1A5276"/>
+          <w:sz w:val="48"/>
+        </w:rPr>
         <w:t>リテアド (RetailMedia-ad)</w:t>
         <w:br/>
-        <w:t>システム要件 ＆ セキュリティ設計仕様書— 開発・エンジニアリング部門向け技術共有資料 —作成日: 2026年6月19日</w:t>
+        <w:t>システム要件 ＆ セキュリティ設計仕様書</w:t>
+      </w:r>
+    </w:p>
+    <w:p>
+      <w:pPr>
+        <w:spacing w:before="0" w:after="80" w:line="276" w:lineRule="auto"/>
+        <w:jc w:val="center"/>
+      </w:pPr>
+      <w:r>
+        <w:rPr>
+          <w:rFonts w:ascii="MS Gothic" w:hAnsi="MS Gothic"/>
+          <w:i/>
+          <w:color w:val="7F8C8D"/>
+          <w:sz w:val="28"/>
+        </w:rPr>
+        <w:br/>
+        <w:t>— 開発・エンジニアリング部門向け技術共有資料 —</w:t>
+      </w:r>
+    </w:p>
+    <w:p>
+      <w:pPr>
+        <w:spacing w:before="0" w:after="80" w:line="276" w:lineRule="auto"/>
+        <w:jc w:val="right"/>
+      </w:pPr>
+      <w:r>
+        <w:rPr>
+          <w:rFonts w:ascii="MS Gothic" w:hAnsi="MS Gothic"/>
+          <w:sz w:val="21"/>
+        </w:rPr>
+        <w:t>作成日: 2026年6月19日</w:t>
         <w:br/>
         <w:t>バージョン: 1.0.0 (改訂版)</w:t>
         <w:br/>
@@ -21,7 +56,7 @@
     </w:p>
     <w:p>
       <w:pPr>
-        <w:spacing w:before="0" w:after="40" w:line="264" w:lineRule="auto"/>
+        <w:spacing w:before="0" w:after="80" w:line="276" w:lineRule="auto"/>
       </w:pPr>
       <w:r>
         <w:br w:type="page"/>
@@ -30,7 +65,7 @@
     <w:p>
       <w:pPr>
         <w:pStyle w:val="Heading1"/>
-        <w:spacing w:before="0" w:after="40" w:line="264" w:lineRule="auto"/>
+        <w:spacing w:before="280" w:after="120" w:line="288" w:lineRule="auto"/>
       </w:pPr>
       <w:r>
         <w:rPr>
@@ -44,7 +79,7 @@
     </w:p>
     <w:p>
       <w:pPr>
-        <w:spacing w:line="264" w:lineRule="auto" w:after="40" w:before="0"/>
+        <w:spacing w:line="276" w:lineRule="auto" w:after="80" w:before="0"/>
       </w:pPr>
       <w:r>
         <w:rPr>
@@ -60,7 +95,7 @@
     <w:p>
       <w:pPr>
         <w:pStyle w:val="Heading1"/>
-        <w:spacing w:before="0" w:after="40" w:line="264" w:lineRule="auto"/>
+        <w:spacing w:before="280" w:after="120" w:line="288" w:lineRule="auto"/>
       </w:pPr>
       <w:r>
         <w:rPr>
@@ -74,7 +109,7 @@
     </w:p>
     <w:p>
       <w:pPr>
-        <w:spacing w:after="40" w:before="0" w:line="264" w:lineRule="auto"/>
+        <w:spacing w:after="80" w:before="0" w:line="276" w:lineRule="auto"/>
       </w:pPr>
       <w:r>
         <w:rPr>
@@ -88,7 +123,7 @@
     <w:p>
       <w:pPr>
         <w:pStyle w:val="ListBullet"/>
-        <w:spacing w:after="40" w:before="0" w:line="264" w:lineRule="auto"/>
+        <w:spacing w:after="80" w:before="0" w:line="276" w:lineRule="auto"/>
       </w:pPr>
       <w:r>
         <w:rPr>
@@ -110,7 +145,7 @@
     <w:p>
       <w:pPr>
         <w:pStyle w:val="ListBullet"/>
-        <w:spacing w:after="40" w:before="0" w:line="264" w:lineRule="auto"/>
+        <w:spacing w:after="80" w:before="0" w:line="276" w:lineRule="auto"/>
       </w:pPr>
       <w:r>
         <w:rPr>
@@ -132,7 +167,7 @@
     <w:p>
       <w:pPr>
         <w:pStyle w:val="ListBullet"/>
-        <w:spacing w:after="40" w:before="0" w:line="264" w:lineRule="auto"/>
+        <w:spacing w:after="80" w:before="0" w:line="276" w:lineRule="auto"/>
       </w:pPr>
       <w:r>
         <w:rPr>
@@ -154,7 +189,7 @@
     <w:p>
       <w:pPr>
         <w:pStyle w:val="ListBullet"/>
-        <w:spacing w:after="40" w:before="0" w:line="264" w:lineRule="auto"/>
+        <w:spacing w:after="80" w:before="0" w:line="276" w:lineRule="auto"/>
       </w:pPr>
       <w:r>
         <w:rPr>
@@ -176,7 +211,7 @@
     <w:p>
       <w:pPr>
         <w:pStyle w:val="ListBullet"/>
-        <w:spacing w:after="40" w:before="0" w:line="264" w:lineRule="auto"/>
+        <w:spacing w:after="80" w:before="0" w:line="276" w:lineRule="auto"/>
       </w:pPr>
       <w:r>
         <w:rPr>
@@ -198,7 +233,7 @@
     <w:p>
       <w:pPr>
         <w:pStyle w:val="ListBullet"/>
-        <w:spacing w:after="40" w:before="0" w:line="264" w:lineRule="auto"/>
+        <w:spacing w:after="80" w:before="0" w:line="276" w:lineRule="auto"/>
       </w:pPr>
       <w:r>
         <w:rPr>
@@ -219,13 +254,13 @@
     </w:p>
     <w:p>
       <w:pPr>
-        <w:spacing w:after="40" w:before="0" w:line="264" w:lineRule="auto"/>
+        <w:spacing w:after="80" w:before="0" w:line="276" w:lineRule="auto"/>
       </w:pPr>
     </w:p>
     <w:p>
       <w:pPr>
         <w:pStyle w:val="Heading1"/>
-        <w:spacing w:before="0" w:after="40" w:line="264" w:lineRule="auto"/>
+        <w:spacing w:before="280" w:after="120" w:line="288" w:lineRule="auto"/>
       </w:pPr>
       <w:r>
         <w:rPr>
@@ -239,7 +274,7 @@
     </w:p>
     <w:p>
       <w:pPr>
-        <w:spacing w:after="40" w:before="0" w:line="264" w:lineRule="auto"/>
+        <w:spacing w:after="80" w:before="0" w:line="276" w:lineRule="auto"/>
       </w:pPr>
       <w:r>
         <w:rPr>
@@ -274,7 +309,7 @@
           </w:tcPr>
           <w:p>
             <w:pPr>
-              <w:spacing w:before="0" w:after="20" w:line="252" w:lineRule="auto"/>
+              <w:spacing w:before="0" w:after="40" w:line="264" w:lineRule="auto"/>
               <w:jc w:val="center"/>
             </w:pPr>
             <w:r>
@@ -301,7 +336,7 @@
           </w:tcPr>
           <w:p>
             <w:pPr>
-              <w:spacing w:before="0" w:after="20" w:line="252" w:lineRule="auto"/>
+              <w:spacing w:before="0" w:after="40" w:line="264" w:lineRule="auto"/>
               <w:jc w:val="center"/>
             </w:pPr>
             <w:r>
@@ -329,7 +364,7 @@
           </w:tcPr>
           <w:p>
             <w:pPr>
-              <w:spacing w:before="0" w:after="20" w:line="252" w:lineRule="auto"/>
+              <w:spacing w:before="0" w:after="40" w:line="264" w:lineRule="auto"/>
             </w:pPr>
             <w:r>
               <w:rPr>
@@ -353,7 +388,7 @@
           </w:tcPr>
           <w:p>
             <w:pPr>
-              <w:spacing w:before="0" w:after="20" w:line="252" w:lineRule="auto"/>
+              <w:spacing w:before="0" w:after="40" w:line="264" w:lineRule="auto"/>
             </w:pPr>
             <w:r>
               <w:rPr>
@@ -379,7 +414,7 @@
           </w:tcPr>
           <w:p>
             <w:pPr>
-              <w:spacing w:before="0" w:after="20" w:line="252" w:lineRule="auto"/>
+              <w:spacing w:before="0" w:after="40" w:line="264" w:lineRule="auto"/>
             </w:pPr>
             <w:r>
               <w:rPr>
@@ -403,7 +438,7 @@
           </w:tcPr>
           <w:p>
             <w:pPr>
-              <w:spacing w:before="0" w:after="20" w:line="252" w:lineRule="auto"/>
+              <w:spacing w:before="0" w:after="40" w:line="264" w:lineRule="auto"/>
             </w:pPr>
             <w:r>
               <w:rPr>
@@ -429,7 +464,7 @@
           </w:tcPr>
           <w:p>
             <w:pPr>
-              <w:spacing w:before="0" w:after="20" w:line="252" w:lineRule="auto"/>
+              <w:spacing w:before="0" w:after="40" w:line="264" w:lineRule="auto"/>
             </w:pPr>
             <w:r>
               <w:rPr>
@@ -453,7 +488,7 @@
           </w:tcPr>
           <w:p>
             <w:pPr>
-              <w:spacing w:before="0" w:after="20" w:line="252" w:lineRule="auto"/>
+              <w:spacing w:before="0" w:after="40" w:line="264" w:lineRule="auto"/>
             </w:pPr>
             <w:r>
               <w:rPr>
@@ -479,7 +514,7 @@
           </w:tcPr>
           <w:p>
             <w:pPr>
-              <w:spacing w:before="0" w:after="20" w:line="252" w:lineRule="auto"/>
+              <w:spacing w:before="0" w:after="40" w:line="264" w:lineRule="auto"/>
             </w:pPr>
             <w:r>
               <w:rPr>
@@ -503,7 +538,7 @@
           </w:tcPr>
           <w:p>
             <w:pPr>
-              <w:spacing w:before="0" w:after="20" w:line="252" w:lineRule="auto"/>
+              <w:spacing w:before="0" w:after="40" w:line="264" w:lineRule="auto"/>
             </w:pPr>
             <w:r>
               <w:rPr>
@@ -529,7 +564,7 @@
           </w:tcPr>
           <w:p>
             <w:pPr>
-              <w:spacing w:before="0" w:after="20" w:line="252" w:lineRule="auto"/>
+              <w:spacing w:before="0" w:after="40" w:line="264" w:lineRule="auto"/>
             </w:pPr>
             <w:r>
               <w:t>AI Content Moderation (アカウント凍結)</w:t>
@@ -548,7 +583,7 @@
           </w:tcPr>
           <w:p>
             <w:pPr>
-              <w:spacing w:before="0" w:after="20" w:line="252" w:lineRule="auto"/>
+              <w:spacing w:before="0" w:after="40" w:line="264" w:lineRule="auto"/>
             </w:pPr>
             <w:r>
               <w:t>AI音声スタジオでの禁止ワード入力時、またはAI広告自動審査での規約違反検知時、アカウントストライクを加算（警告）し、累積3ストライクに達した時点でアカウントを即座にロック（BAN）します。</w:t>
@@ -569,7 +604,7 @@
           </w:tcPr>
           <w:p>
             <w:pPr>
-              <w:spacing w:before="0" w:after="20" w:line="252" w:lineRule="auto"/>
+              <w:spacing w:before="0" w:after="40" w:line="264" w:lineRule="auto"/>
             </w:pPr>
             <w:r>
               <w:rPr>
@@ -593,7 +628,7 @@
           </w:tcPr>
           <w:p>
             <w:pPr>
-              <w:spacing w:before="0" w:after="20" w:line="252" w:lineRule="auto"/>
+              <w:spacing w:before="0" w:after="40" w:line="264" w:lineRule="auto"/>
             </w:pPr>
             <w:r>
               <w:rPr>
@@ -619,7 +654,7 @@
           </w:tcPr>
           <w:p>
             <w:pPr>
-              <w:spacing w:before="0" w:after="20" w:line="252" w:lineRule="auto"/>
+              <w:spacing w:before="0" w:after="40" w:line="264" w:lineRule="auto"/>
             </w:pPr>
             <w:r>
               <w:rPr>
@@ -643,7 +678,7 @@
           </w:tcPr>
           <w:p>
             <w:pPr>
-              <w:spacing w:before="0" w:after="20" w:line="252" w:lineRule="auto"/>
+              <w:spacing w:before="0" w:after="40" w:line="264" w:lineRule="auto"/>
             </w:pPr>
             <w:r>
               <w:rPr>
@@ -663,7 +698,7 @@
           </w:tcPr>
           <w:p>
             <w:pPr>
-              <w:spacing w:before="0" w:after="20" w:line="252" w:lineRule="auto"/>
+              <w:spacing w:before="0" w:after="40" w:line="264" w:lineRule="auto"/>
             </w:pPr>
             <w:r>
               <w:t>DBマイグレーション起動デッドロック防止＆自動タイムアウト</w:t>
@@ -676,7 +711,7 @@
           </w:tcPr>
           <w:p>
             <w:pPr>
-              <w:spacing w:before="0" w:after="20" w:line="252" w:lineRule="auto"/>
+              <w:spacing w:before="0" w:after="40" w:line="264" w:lineRule="auto"/>
             </w:pPr>
             <w:r>
               <w:t>新旧コンテナ起動時のテーブルロック競合（ALTER TABLE等による排他ロック待ち）を排除するため、単一の接続クライアント内で SET lock_timeout = 5000 を強制適用し、万が一のタイムアウト時もエラーをキャッチして起動を継続する、極めて耐障害性の高いマイグレーション設計を導入。</w:t>
@@ -691,7 +726,7 @@
           </w:tcPr>
           <w:p>
             <w:pPr>
-              <w:spacing w:before="0" w:after="20" w:line="252" w:lineRule="auto"/>
+              <w:spacing w:before="0" w:after="40" w:line="264" w:lineRule="auto"/>
             </w:pPr>
             <w:r>
               <w:t>クロスロール2FA（二段階認証）の動的同期</w:t>
@@ -704,7 +739,7 @@
           </w:tcPr>
           <w:p>
             <w:pPr>
-              <w:spacing w:before="0" w:after="20" w:line="252" w:lineRule="auto"/>
+              <w:spacing w:before="0" w:after="40" w:line="264" w:lineRule="auto"/>
             </w:pPr>
             <w:r>
               <w:t>同一メールアドレスで「店舗」や「広告主」など複数のロールを持つユーザーが、一方のロールで2FAを有効化した場合、もう一方のロールログイン時にも2FAシークレットをデータベース上で自動同期・強制適用。ユーザーの利便性を損なわずにシステム全体の安全性を担保。</w:t>
@@ -719,7 +754,7 @@
           </w:tcPr>
           <w:p>
             <w:pPr>
-              <w:spacing w:before="0" w:after="20" w:line="252" w:lineRule="auto"/>
+              <w:spacing w:before="0" w:after="40" w:line="264" w:lineRule="auto"/>
             </w:pPr>
             <w:r>
               <w:t>添付ファイルの安全なデコード保存とXSSの徹底排除</w:t>
@@ -732,7 +767,7 @@
           </w:tcPr>
           <w:p>
             <w:pPr>
-              <w:spacing w:before="0" w:after="20" w:line="252" w:lineRule="auto"/>
+              <w:spacing w:before="0" w:after="40" w:line="264" w:lineRule="auto"/>
             </w:pPr>
             <w:r>
               <w:t>お問い合わせフォーム等から送信された添付画像（Base64）データをサーバー側で安全にバイナリデコードしてディスク（uploads/contacts/）に隔離保存。管理者画面での受信一覧の表示時には、エスケープ処理（escapeHtml）を適用した上で安全なレンダリングを行い、XSS（クロスサイトスクリプティング）を完全に無害化。</w:t>
@@ -747,7 +782,7 @@
           </w:tcPr>
           <w:p>
             <w:pPr>
-              <w:spacing w:before="0" w:after="20" w:line="252" w:lineRule="auto"/>
+              <w:spacing w:before="0" w:after="40" w:line="264" w:lineRule="auto"/>
             </w:pPr>
             <w:r>
               <w:t>CORSおよびミドルウェアの適用漏れ自動防御</w:t>
@@ -760,7 +795,7 @@
           </w:tcPr>
           <w:p>
             <w:pPr>
-              <w:spacing w:before="0" w:after="20" w:line="252" w:lineRule="auto"/>
+              <w:spacing w:before="0" w:after="40" w:line="264" w:lineRule="auto"/>
             </w:pPr>
             <w:r>
               <w:t>CORSブロックによる通信切断を防ぐため、すべてのルートハンドラよりも上部で Express CORS ミドルウェアを一律に適用し、Credentialsが不要なセッションではOrigin「*」を許容しつつ、トークンによる認証を並行して機能させることで、ブラウザ側のCORS拒否を完全に回避。</w:t>
@@ -771,13 +806,13 @@
     </w:tbl>
     <w:p>
       <w:pPr>
-        <w:spacing w:after="40" w:before="0" w:line="264" w:lineRule="auto"/>
+        <w:spacing w:after="80" w:before="0" w:line="276" w:lineRule="auto"/>
       </w:pPr>
     </w:p>
     <w:p>
       <w:pPr>
         <w:pStyle w:val="Heading1"/>
-        <w:spacing w:before="0" w:after="40" w:line="264" w:lineRule="auto"/>
+        <w:spacing w:before="280" w:after="120" w:line="288" w:lineRule="auto"/>
       </w:pPr>
       <w:r>
         <w:rPr>
@@ -791,7 +826,7 @@
     </w:p>
     <w:p>
       <w:pPr>
-        <w:spacing w:line="264" w:lineRule="auto" w:after="40" w:before="0"/>
+        <w:spacing w:line="276" w:lineRule="auto" w:after="80" w:before="0"/>
       </w:pPr>
       <w:r>
         <w:rPr>
@@ -806,7 +841,7 @@
     </w:p>
     <w:p>
       <w:pPr>
-        <w:spacing w:after="40" w:before="0" w:line="264" w:lineRule="auto"/>
+        <w:spacing w:after="120" w:before="280" w:line="288" w:lineRule="auto"/>
         <w:ind w:left="288"/>
       </w:pPr>
       <w:r>
@@ -830,7 +865,7 @@
     </w:p>
     <w:p>
       <w:pPr>
-        <w:spacing w:after="40" w:before="0" w:line="264" w:lineRule="auto"/>
+        <w:spacing w:after="120" w:before="280" w:line="288" w:lineRule="auto"/>
         <w:ind w:left="288"/>
       </w:pPr>
       <w:r>
@@ -854,7 +889,7 @@
     </w:p>
     <w:p>
       <w:pPr>
-        <w:spacing w:after="40" w:before="0" w:line="264" w:lineRule="auto"/>
+        <w:spacing w:after="120" w:before="280" w:line="288" w:lineRule="auto"/>
         <w:ind w:left="288"/>
       </w:pPr>
       <w:r>
@@ -878,13 +913,13 @@
     </w:p>
     <w:p>
       <w:pPr>
-        <w:spacing w:after="40" w:before="0" w:line="264" w:lineRule="auto"/>
+        <w:spacing w:after="80" w:before="0" w:line="276" w:lineRule="auto"/>
       </w:pPr>
     </w:p>
     <w:p>
       <w:pPr>
         <w:pStyle w:val="Heading1"/>
-        <w:spacing w:before="0" w:after="40" w:line="264" w:lineRule="auto"/>
+        <w:spacing w:before="280" w:after="120" w:line="288" w:lineRule="auto"/>
       </w:pPr>
       <w:r>
         <w:rPr>
@@ -898,7 +933,7 @@
     </w:p>
     <w:p>
       <w:pPr>
-        <w:spacing w:line="264" w:lineRule="auto" w:after="40" w:before="0"/>
+        <w:spacing w:line="276" w:lineRule="auto" w:after="80" w:before="0"/>
       </w:pPr>
       <w:r>
         <w:rPr>
@@ -912,7 +947,7 @@
     <w:p>
       <w:pPr>
         <w:pStyle w:val="ListBullet"/>
-        <w:spacing w:after="40" w:before="0" w:line="264" w:lineRule="auto"/>
+        <w:spacing w:after="80" w:before="0" w:line="276" w:lineRule="auto"/>
       </w:pPr>
       <w:r>
         <w:rPr>
@@ -926,7 +961,7 @@
     <w:p>
       <w:pPr>
         <w:pStyle w:val="ListBullet"/>
-        <w:spacing w:after="40" w:before="0" w:line="264" w:lineRule="auto"/>
+        <w:spacing w:after="80" w:before="0" w:line="276" w:lineRule="auto"/>
       </w:pPr>
       <w:r>
         <w:rPr>
@@ -940,7 +975,7 @@
     <w:p>
       <w:pPr>
         <w:pStyle w:val="ListBullet"/>
-        <w:spacing w:after="40" w:before="0" w:line="264" w:lineRule="auto"/>
+        <w:spacing w:after="80" w:before="0" w:line="276" w:lineRule="auto"/>
       </w:pPr>
       <w:r>
         <w:rPr>
@@ -953,13 +988,13 @@
     </w:p>
     <w:p>
       <w:pPr>
-        <w:spacing w:before="0" w:after="40" w:line="264" w:lineRule="auto"/>
+        <w:spacing w:before="0" w:after="80" w:line="276" w:lineRule="auto"/>
       </w:pPr>
     </w:p>
     <w:p>
       <w:pPr>
         <w:pStyle w:val="Heading1"/>
-        <w:spacing w:before="0" w:after="40" w:line="264" w:lineRule="auto"/>
+        <w:spacing w:before="280" w:after="120" w:line="288" w:lineRule="auto"/>
       </w:pPr>
       <w:r>
         <w:t>6. 他システムとの差別化要素（セキュアUX ＆ 高レジリエンス設計）</w:t>
@@ -967,7 +1002,7 @@
     </w:p>
     <w:p>
       <w:pPr>
-        <w:spacing w:before="0" w:after="40" w:line="264" w:lineRule="auto"/>
+        <w:spacing w:before="0" w:after="80" w:line="276" w:lineRule="auto"/>
       </w:pPr>
       <w:r>
         <w:rPr>
@@ -980,7 +1015,7 @@
     </w:p>
     <w:p>
       <w:pPr>
-        <w:spacing w:before="0" w:after="40" w:line="264" w:lineRule="auto"/>
+        <w:spacing w:before="280" w:after="120" w:line="288" w:lineRule="auto"/>
       </w:pPr>
       <w:r>
         <w:rPr>
@@ -995,7 +1030,7 @@
     </w:p>
     <w:p>
       <w:pPr>
-        <w:spacing w:before="0" w:after="40" w:line="264" w:lineRule="auto"/>
+        <w:spacing w:before="280" w:after="120" w:line="288" w:lineRule="auto"/>
       </w:pPr>
       <w:r>
         <w:rPr>
@@ -1010,7 +1045,7 @@
     </w:p>
     <w:p>
       <w:pPr>
-        <w:spacing w:before="0" w:after="40" w:line="264" w:lineRule="auto"/>
+        <w:spacing w:before="280" w:after="120" w:line="288" w:lineRule="auto"/>
       </w:pPr>
       <w:r>
         <w:t>■ ローカル・本番のハイブリッド実行環境（DB動的ローテーション）</w:t>
@@ -1020,7 +1055,7 @@
     </w:p>
     <w:p>
       <w:pPr>
-        <w:spacing w:before="0" w:after="40" w:line="264" w:lineRule="auto"/>
+        <w:spacing w:before="280" w:after="120" w:line="288" w:lineRule="auto"/>
       </w:pPr>
       <w:r>
         <w:br/>
@@ -1029,7 +1064,7 @@
     </w:p>
     <w:p>
       <w:pPr>
-        <w:spacing w:before="0" w:after="40" w:line="264" w:lineRule="auto"/>
+        <w:spacing w:before="0" w:after="80" w:line="276" w:lineRule="auto"/>
       </w:pPr>
       <w:r>
         <w:t>店舗オーナー（store）のプロフィール設定画面に「住所」および「店舗業態セグメント」の入力機能を追加。入力された住所情報をバックエンド側で自動的にパースし、都道府県および対応する配信エリア（関東、関西等）を自動判定してデータベースおよびS3に永続保存します。これにより、広告主（advertiser）が指定したエリア・都道府県・業態フィルタリング条件と完全一致する広告のみをサイネージに配信するリアルタイムマッチングを実現しています。</w:t>
@@ -1037,7 +1072,7 @@
     </w:p>
     <w:p>
       <w:pPr>
-        <w:spacing w:before="0" w:after="40" w:line="264" w:lineRule="auto"/>
+        <w:spacing w:before="280" w:after="120" w:line="288" w:lineRule="auto"/>
       </w:pPr>
       <w:r>
         <w:br/>
@@ -1046,7 +1081,7 @@
     </w:p>
     <w:p>
       <w:pPr>
-        <w:spacing w:before="0" w:after="40" w:line="264" w:lineRule="auto"/>
+        <w:spacing w:before="0" w:after="80" w:line="276" w:lineRule="auto"/>
       </w:pPr>
       <w:r>
         <w:t>広告主ダッシュボードからの不要なリテーラー遷移リンクを廃止し、店舗ポータル（store_portal）の最近のトランザクションカード下にリンクを適正配置。クリック時は直接遷移させず、ログイン画面（index.html?role=store）を最優先で経由させ、安全な認証手続きを強制したうえでポータルへと導くセキュアな動線制御を徹底しています。</w:t>

</xml_diff>

<commit_message>
Update specifications with database direct query persistence and fix Table column width
</commit_message>
<xml_diff>
--- a/RetailMedia_Secure_Specs.docx
+++ b/RetailMedia_Secure_Specs.docx
@@ -4,7 +4,7 @@
   <w:body>
     <w:p>
       <w:pPr>
-        <w:spacing w:before="280" w:after="120" w:line="288" w:lineRule="auto"/>
+        <w:spacing w:before="280" w:after="160" w:line="288" w:lineRule="auto"/>
         <w:jc w:val="center"/>
       </w:pPr>
       <w:r>
@@ -21,7 +21,7 @@
     </w:p>
     <w:p>
       <w:pPr>
-        <w:spacing w:before="0" w:after="80" w:line="276" w:lineRule="auto"/>
+        <w:spacing w:before="0" w:after="120" w:line="276" w:lineRule="auto"/>
         <w:jc w:val="center"/>
       </w:pPr>
       <w:r>
@@ -37,7 +37,7 @@
     </w:p>
     <w:p>
       <w:pPr>
-        <w:spacing w:before="0" w:after="80" w:line="276" w:lineRule="auto"/>
+        <w:spacing w:before="0" w:after="120" w:line="276" w:lineRule="auto"/>
         <w:jc w:val="right"/>
       </w:pPr>
       <w:r>
@@ -56,7 +56,7 @@
     </w:p>
     <w:p>
       <w:pPr>
-        <w:spacing w:before="0" w:after="80" w:line="276" w:lineRule="auto"/>
+        <w:spacing w:before="0" w:after="120" w:line="276" w:lineRule="auto"/>
       </w:pPr>
       <w:r>
         <w:br w:type="page"/>
@@ -65,7 +65,7 @@
     <w:p>
       <w:pPr>
         <w:pStyle w:val="Heading1"/>
-        <w:spacing w:before="280" w:after="120" w:line="288" w:lineRule="auto"/>
+        <w:spacing w:before="280" w:after="160" w:line="288" w:lineRule="auto"/>
       </w:pPr>
       <w:r>
         <w:rPr>
@@ -79,7 +79,7 @@
     </w:p>
     <w:p>
       <w:pPr>
-        <w:spacing w:line="276" w:lineRule="auto" w:after="80" w:before="0"/>
+        <w:spacing w:line="276" w:lineRule="auto" w:after="120" w:before="0"/>
       </w:pPr>
       <w:r>
         <w:rPr>
@@ -95,7 +95,7 @@
     <w:p>
       <w:pPr>
         <w:pStyle w:val="Heading1"/>
-        <w:spacing w:before="280" w:after="120" w:line="288" w:lineRule="auto"/>
+        <w:spacing w:before="280" w:after="160" w:line="288" w:lineRule="auto"/>
       </w:pPr>
       <w:r>
         <w:rPr>
@@ -109,7 +109,7 @@
     </w:p>
     <w:p>
       <w:pPr>
-        <w:spacing w:after="80" w:before="0" w:line="276" w:lineRule="auto"/>
+        <w:spacing w:after="120" w:before="0" w:line="276" w:lineRule="auto"/>
       </w:pPr>
       <w:r>
         <w:rPr>
@@ -123,7 +123,7 @@
     <w:p>
       <w:pPr>
         <w:pStyle w:val="ListBullet"/>
-        <w:spacing w:after="80" w:before="0" w:line="276" w:lineRule="auto"/>
+        <w:spacing w:after="120" w:before="0" w:line="276" w:lineRule="auto"/>
       </w:pPr>
       <w:r>
         <w:rPr>
@@ -145,7 +145,7 @@
     <w:p>
       <w:pPr>
         <w:pStyle w:val="ListBullet"/>
-        <w:spacing w:after="80" w:before="0" w:line="276" w:lineRule="auto"/>
+        <w:spacing w:after="120" w:before="0" w:line="276" w:lineRule="auto"/>
       </w:pPr>
       <w:r>
         <w:rPr>
@@ -167,7 +167,7 @@
     <w:p>
       <w:pPr>
         <w:pStyle w:val="ListBullet"/>
-        <w:spacing w:after="80" w:before="0" w:line="276" w:lineRule="auto"/>
+        <w:spacing w:after="120" w:before="0" w:line="276" w:lineRule="auto"/>
       </w:pPr>
       <w:r>
         <w:rPr>
@@ -189,7 +189,7 @@
     <w:p>
       <w:pPr>
         <w:pStyle w:val="ListBullet"/>
-        <w:spacing w:after="80" w:before="0" w:line="276" w:lineRule="auto"/>
+        <w:spacing w:after="120" w:before="0" w:line="276" w:lineRule="auto"/>
       </w:pPr>
       <w:r>
         <w:rPr>
@@ -211,7 +211,7 @@
     <w:p>
       <w:pPr>
         <w:pStyle w:val="ListBullet"/>
-        <w:spacing w:after="80" w:before="0" w:line="276" w:lineRule="auto"/>
+        <w:spacing w:after="120" w:before="0" w:line="276" w:lineRule="auto"/>
       </w:pPr>
       <w:r>
         <w:rPr>
@@ -233,7 +233,7 @@
     <w:p>
       <w:pPr>
         <w:pStyle w:val="ListBullet"/>
-        <w:spacing w:after="80" w:before="0" w:line="276" w:lineRule="auto"/>
+        <w:spacing w:after="120" w:before="0" w:line="276" w:lineRule="auto"/>
       </w:pPr>
       <w:r>
         <w:rPr>
@@ -254,13 +254,13 @@
     </w:p>
     <w:p>
       <w:pPr>
-        <w:spacing w:after="80" w:before="0" w:line="276" w:lineRule="auto"/>
+        <w:spacing w:after="120" w:before="0" w:line="276" w:lineRule="auto"/>
       </w:pPr>
     </w:p>
     <w:p>
       <w:pPr>
         <w:pStyle w:val="Heading1"/>
-        <w:spacing w:before="280" w:after="120" w:line="288" w:lineRule="auto"/>
+        <w:spacing w:before="280" w:after="160" w:line="288" w:lineRule="auto"/>
       </w:pPr>
       <w:r>
         <w:rPr>
@@ -274,7 +274,7 @@
     </w:p>
     <w:p>
       <w:pPr>
-        <w:spacing w:after="80" w:before="0" w:line="276" w:lineRule="auto"/>
+        <w:spacing w:after="120" w:before="0" w:line="276" w:lineRule="auto"/>
       </w:pPr>
       <w:r>
         <w:rPr>
@@ -289,6 +289,7 @@
       <w:tblPr>
         <w:tblStyle w:val="LightShading-Accent1"/>
         <w:tblW w:type="auto" w:w="0"/>
+        <w:tblLayout w:type="fixed"/>
         <w:tblLook w:firstColumn="1" w:firstRow="1" w:lastColumn="0" w:lastRow="0" w:noHBand="0" w:noVBand="1" w:val="04A0"/>
       </w:tblPr>
       <w:tblGrid>
@@ -298,7 +299,7 @@
       <w:tr>
         <w:tc>
           <w:tcPr>
-            <w:tcW w:type="dxa" w:w="4680"/>
+            <w:tcW w:type="dxa" w:w="2592"/>
             <w:shd w:fill="1A5276"/>
             <w:tcMar>
               <w:top w:w="140" w:type="dxa"/>
@@ -309,7 +310,7 @@
           </w:tcPr>
           <w:p>
             <w:pPr>
-              <w:spacing w:before="0" w:after="40" w:line="264" w:lineRule="auto"/>
+              <w:spacing w:before="0" w:after="80" w:line="264" w:lineRule="auto"/>
               <w:jc w:val="center"/>
             </w:pPr>
             <w:r>
@@ -325,7 +326,7 @@
         </w:tc>
         <w:tc>
           <w:tcPr>
-            <w:tcW w:type="dxa" w:w="4680"/>
+            <w:tcW w:type="dxa" w:w="6768"/>
             <w:shd w:fill="1A5276"/>
             <w:tcMar>
               <w:top w:w="140" w:type="dxa"/>
@@ -336,7 +337,7 @@
           </w:tcPr>
           <w:p>
             <w:pPr>
-              <w:spacing w:before="0" w:after="40" w:line="264" w:lineRule="auto"/>
+              <w:spacing w:before="0" w:after="80" w:line="264" w:lineRule="auto"/>
               <w:jc w:val="center"/>
             </w:pPr>
             <w:r>
@@ -354,7 +355,7 @@
       <w:tr>
         <w:tc>
           <w:tcPr>
-            <w:tcW w:type="dxa" w:w="4680"/>
+            <w:tcW w:type="dxa" w:w="2592"/>
             <w:tcMar>
               <w:top w:w="100" w:type="dxa"/>
               <w:bottom w:w="100" w:type="dxa"/>
@@ -364,7 +365,7 @@
           </w:tcPr>
           <w:p>
             <w:pPr>
-              <w:spacing w:before="0" w:after="40" w:line="264" w:lineRule="auto"/>
+              <w:spacing w:before="0" w:after="80" w:line="264" w:lineRule="auto"/>
             </w:pPr>
             <w:r>
               <w:rPr>
@@ -378,7 +379,7 @@
         </w:tc>
         <w:tc>
           <w:tcPr>
-            <w:tcW w:type="dxa" w:w="4680"/>
+            <w:tcW w:type="dxa" w:w="6768"/>
             <w:tcMar>
               <w:top w:w="100" w:type="dxa"/>
               <w:bottom w:w="100" w:type="dxa"/>
@@ -388,7 +389,7 @@
           </w:tcPr>
           <w:p>
             <w:pPr>
-              <w:spacing w:before="0" w:after="40" w:line="264" w:lineRule="auto"/>
+              <w:spacing w:before="0" w:after="80" w:line="264" w:lineRule="auto"/>
             </w:pPr>
             <w:r>
               <w:rPr>
@@ -404,7 +405,7 @@
       <w:tr>
         <w:tc>
           <w:tcPr>
-            <w:tcW w:type="dxa" w:w="4680"/>
+            <w:tcW w:type="dxa" w:w="2592"/>
             <w:tcMar>
               <w:top w:w="100" w:type="dxa"/>
               <w:bottom w:w="100" w:type="dxa"/>
@@ -414,7 +415,7 @@
           </w:tcPr>
           <w:p>
             <w:pPr>
-              <w:spacing w:before="0" w:after="40" w:line="264" w:lineRule="auto"/>
+              <w:spacing w:before="0" w:after="80" w:line="264" w:lineRule="auto"/>
             </w:pPr>
             <w:r>
               <w:rPr>
@@ -428,7 +429,7 @@
         </w:tc>
         <w:tc>
           <w:tcPr>
-            <w:tcW w:type="dxa" w:w="4680"/>
+            <w:tcW w:type="dxa" w:w="6768"/>
             <w:tcMar>
               <w:top w:w="100" w:type="dxa"/>
               <w:bottom w:w="100" w:type="dxa"/>
@@ -438,7 +439,7 @@
           </w:tcPr>
           <w:p>
             <w:pPr>
-              <w:spacing w:before="0" w:after="40" w:line="264" w:lineRule="auto"/>
+              <w:spacing w:before="0" w:after="80" w:line="264" w:lineRule="auto"/>
             </w:pPr>
             <w:r>
               <w:rPr>
@@ -454,7 +455,7 @@
       <w:tr>
         <w:tc>
           <w:tcPr>
-            <w:tcW w:type="dxa" w:w="4680"/>
+            <w:tcW w:type="dxa" w:w="2592"/>
             <w:tcMar>
               <w:top w:w="100" w:type="dxa"/>
               <w:bottom w:w="100" w:type="dxa"/>
@@ -464,7 +465,7 @@
           </w:tcPr>
           <w:p>
             <w:pPr>
-              <w:spacing w:before="0" w:after="40" w:line="264" w:lineRule="auto"/>
+              <w:spacing w:before="0" w:after="80" w:line="264" w:lineRule="auto"/>
             </w:pPr>
             <w:r>
               <w:rPr>
@@ -478,7 +479,7 @@
         </w:tc>
         <w:tc>
           <w:tcPr>
-            <w:tcW w:type="dxa" w:w="4680"/>
+            <w:tcW w:type="dxa" w:w="6768"/>
             <w:tcMar>
               <w:top w:w="100" w:type="dxa"/>
               <w:bottom w:w="100" w:type="dxa"/>
@@ -488,7 +489,7 @@
           </w:tcPr>
           <w:p>
             <w:pPr>
-              <w:spacing w:before="0" w:after="40" w:line="264" w:lineRule="auto"/>
+              <w:spacing w:before="0" w:after="80" w:line="264" w:lineRule="auto"/>
             </w:pPr>
             <w:r>
               <w:rPr>
@@ -504,7 +505,7 @@
       <w:tr>
         <w:tc>
           <w:tcPr>
-            <w:tcW w:type="dxa" w:w="4680"/>
+            <w:tcW w:type="dxa" w:w="2592"/>
             <w:tcMar>
               <w:top w:w="100" w:type="dxa"/>
               <w:bottom w:w="100" w:type="dxa"/>
@@ -514,7 +515,7 @@
           </w:tcPr>
           <w:p>
             <w:pPr>
-              <w:spacing w:before="0" w:after="40" w:line="264" w:lineRule="auto"/>
+              <w:spacing w:before="0" w:after="80" w:line="264" w:lineRule="auto"/>
             </w:pPr>
             <w:r>
               <w:rPr>
@@ -528,7 +529,7 @@
         </w:tc>
         <w:tc>
           <w:tcPr>
-            <w:tcW w:type="dxa" w:w="4680"/>
+            <w:tcW w:type="dxa" w:w="6768"/>
             <w:tcMar>
               <w:top w:w="100" w:type="dxa"/>
               <w:bottom w:w="100" w:type="dxa"/>
@@ -538,7 +539,7 @@
           </w:tcPr>
           <w:p>
             <w:pPr>
-              <w:spacing w:before="0" w:after="40" w:line="264" w:lineRule="auto"/>
+              <w:spacing w:before="0" w:after="80" w:line="264" w:lineRule="auto"/>
             </w:pPr>
             <w:r>
               <w:rPr>
@@ -554,7 +555,7 @@
       <w:tr>
         <w:tc>
           <w:tcPr>
-            <w:tcW w:type="dxa" w:w="4680"/>
+            <w:tcW w:type="dxa" w:w="2592"/>
             <w:tcMar>
               <w:top w:w="100" w:type="dxa"/>
               <w:bottom w:w="100" w:type="dxa"/>
@@ -564,7 +565,7 @@
           </w:tcPr>
           <w:p>
             <w:pPr>
-              <w:spacing w:before="0" w:after="40" w:line="264" w:lineRule="auto"/>
+              <w:spacing w:before="0" w:after="80" w:line="264" w:lineRule="auto"/>
             </w:pPr>
             <w:r>
               <w:t>AI Content Moderation (アカウント凍結)</w:t>
@@ -573,7 +574,7 @@
         </w:tc>
         <w:tc>
           <w:tcPr>
-            <w:tcW w:type="dxa" w:w="4680"/>
+            <w:tcW w:type="dxa" w:w="6768"/>
             <w:tcMar>
               <w:top w:w="100" w:type="dxa"/>
               <w:bottom w:w="100" w:type="dxa"/>
@@ -583,7 +584,7 @@
           </w:tcPr>
           <w:p>
             <w:pPr>
-              <w:spacing w:before="0" w:after="40" w:line="264" w:lineRule="auto"/>
+              <w:spacing w:before="0" w:after="80" w:line="264" w:lineRule="auto"/>
             </w:pPr>
             <w:r>
               <w:t>AI音声スタジオでの禁止ワード入力時、またはAI広告自動審査での規約違反検知時、アカウントストライクを加算（警告）し、累積3ストライクに達した時点でアカウントを即座にロック（BAN）します。</w:t>
@@ -594,7 +595,7 @@
       <w:tr>
         <w:tc>
           <w:tcPr>
-            <w:tcW w:type="dxa" w:w="4680"/>
+            <w:tcW w:type="dxa" w:w="2592"/>
             <w:tcMar>
               <w:top w:w="100" w:type="dxa"/>
               <w:bottom w:w="100" w:type="dxa"/>
@@ -604,7 +605,7 @@
           </w:tcPr>
           <w:p>
             <w:pPr>
-              <w:spacing w:before="0" w:after="40" w:line="264" w:lineRule="auto"/>
+              <w:spacing w:before="0" w:after="80" w:line="264" w:lineRule="auto"/>
             </w:pPr>
             <w:r>
               <w:rPr>
@@ -618,7 +619,7 @@
         </w:tc>
         <w:tc>
           <w:tcPr>
-            <w:tcW w:type="dxa" w:w="4680"/>
+            <w:tcW w:type="dxa" w:w="6768"/>
             <w:tcMar>
               <w:top w:w="100" w:type="dxa"/>
               <w:bottom w:w="100" w:type="dxa"/>
@@ -628,7 +629,7 @@
           </w:tcPr>
           <w:p>
             <w:pPr>
-              <w:spacing w:before="0" w:after="40" w:line="264" w:lineRule="auto"/>
+              <w:spacing w:before="0" w:after="80" w:line="264" w:lineRule="auto"/>
             </w:pPr>
             <w:r>
               <w:rPr>
@@ -644,7 +645,7 @@
       <w:tr>
         <w:tc>
           <w:tcPr>
-            <w:tcW w:type="dxa" w:w="4680"/>
+            <w:tcW w:type="dxa" w:w="2592"/>
             <w:tcMar>
               <w:top w:w="100" w:type="dxa"/>
               <w:bottom w:w="100" w:type="dxa"/>
@@ -654,7 +655,7 @@
           </w:tcPr>
           <w:p>
             <w:pPr>
-              <w:spacing w:before="0" w:after="40" w:line="264" w:lineRule="auto"/>
+              <w:spacing w:before="0" w:after="80" w:line="264" w:lineRule="auto"/>
             </w:pPr>
             <w:r>
               <w:rPr>
@@ -668,7 +669,7 @@
         </w:tc>
         <w:tc>
           <w:tcPr>
-            <w:tcW w:type="dxa" w:w="4680"/>
+            <w:tcW w:type="dxa" w:w="6768"/>
             <w:tcMar>
               <w:top w:w="100" w:type="dxa"/>
               <w:bottom w:w="100" w:type="dxa"/>
@@ -678,7 +679,7 @@
           </w:tcPr>
           <w:p>
             <w:pPr>
-              <w:spacing w:before="0" w:after="40" w:line="264" w:lineRule="auto"/>
+              <w:spacing w:before="0" w:after="80" w:line="264" w:lineRule="auto"/>
             </w:pPr>
             <w:r>
               <w:rPr>
@@ -694,11 +695,11 @@
       <w:tr>
         <w:tc>
           <w:tcPr>
-            <w:tcW w:type="dxa" w:w="4680"/>
+            <w:tcW w:type="dxa" w:w="2592"/>
           </w:tcPr>
           <w:p>
             <w:pPr>
-              <w:spacing w:before="0" w:after="40" w:line="264" w:lineRule="auto"/>
+              <w:spacing w:before="0" w:after="80" w:line="264" w:lineRule="auto"/>
             </w:pPr>
             <w:r>
               <w:t>DBマイグレーション起動デッドロック防止＆自動タイムアウト</w:t>
@@ -707,11 +708,11 @@
         </w:tc>
         <w:tc>
           <w:tcPr>
-            <w:tcW w:type="dxa" w:w="4680"/>
+            <w:tcW w:type="dxa" w:w="6768"/>
           </w:tcPr>
           <w:p>
             <w:pPr>
-              <w:spacing w:before="0" w:after="40" w:line="264" w:lineRule="auto"/>
+              <w:spacing w:before="0" w:after="80" w:line="264" w:lineRule="auto"/>
             </w:pPr>
             <w:r>
               <w:t>新旧コンテナ起動時のテーブルロック競合（ALTER TABLE等による排他ロック待ち）を排除するため、単一の接続クライアント内で SET lock_timeout = 5000 を強制適用し、万が一のタイムアウト時もエラーをキャッチして起動を継続する、極めて耐障害性の高いマイグレーション設計を導入。</w:t>
@@ -722,11 +723,11 @@
       <w:tr>
         <w:tc>
           <w:tcPr>
-            <w:tcW w:type="dxa" w:w="4680"/>
+            <w:tcW w:type="dxa" w:w="2592"/>
           </w:tcPr>
           <w:p>
             <w:pPr>
-              <w:spacing w:before="0" w:after="40" w:line="264" w:lineRule="auto"/>
+              <w:spacing w:before="0" w:after="80" w:line="264" w:lineRule="auto"/>
             </w:pPr>
             <w:r>
               <w:t>クロスロール2FA（二段階認証）の動的同期</w:t>
@@ -735,11 +736,11 @@
         </w:tc>
         <w:tc>
           <w:tcPr>
-            <w:tcW w:type="dxa" w:w="4680"/>
+            <w:tcW w:type="dxa" w:w="6768"/>
           </w:tcPr>
           <w:p>
             <w:pPr>
-              <w:spacing w:before="0" w:after="40" w:line="264" w:lineRule="auto"/>
+              <w:spacing w:before="0" w:after="80" w:line="264" w:lineRule="auto"/>
             </w:pPr>
             <w:r>
               <w:t>同一メールアドレスで「店舗」や「広告主」など複数のロールを持つユーザーが、一方のロールで2FAを有効化した場合、もう一方のロールログイン時にも2FAシークレットをデータベース上で自動同期・強制適用。ユーザーの利便性を損なわずにシステム全体の安全性を担保。</w:t>
@@ -750,11 +751,11 @@
       <w:tr>
         <w:tc>
           <w:tcPr>
-            <w:tcW w:type="dxa" w:w="4680"/>
+            <w:tcW w:type="dxa" w:w="2592"/>
           </w:tcPr>
           <w:p>
             <w:pPr>
-              <w:spacing w:before="0" w:after="40" w:line="264" w:lineRule="auto"/>
+              <w:spacing w:before="0" w:after="80" w:line="264" w:lineRule="auto"/>
             </w:pPr>
             <w:r>
               <w:t>添付ファイルの安全なデコード保存とXSSの徹底排除</w:t>
@@ -763,11 +764,11 @@
         </w:tc>
         <w:tc>
           <w:tcPr>
-            <w:tcW w:type="dxa" w:w="4680"/>
+            <w:tcW w:type="dxa" w:w="6768"/>
           </w:tcPr>
           <w:p>
             <w:pPr>
-              <w:spacing w:before="0" w:after="40" w:line="264" w:lineRule="auto"/>
+              <w:spacing w:before="0" w:after="80" w:line="264" w:lineRule="auto"/>
             </w:pPr>
             <w:r>
               <w:t>お問い合わせフォーム等から送信された添付画像（Base64）データをサーバー側で安全にバイナリデコードしてディスク（uploads/contacts/）に隔離保存。管理者画面での受信一覧の表示時には、エスケープ処理（escapeHtml）を適用した上で安全なレンダリングを行い、XSS（クロスサイトスクリプティング）を完全に無害化。</w:t>
@@ -778,11 +779,11 @@
       <w:tr>
         <w:tc>
           <w:tcPr>
-            <w:tcW w:type="dxa" w:w="4680"/>
+            <w:tcW w:type="dxa" w:w="2592"/>
           </w:tcPr>
           <w:p>
             <w:pPr>
-              <w:spacing w:before="0" w:after="40" w:line="264" w:lineRule="auto"/>
+              <w:spacing w:before="0" w:after="80" w:line="264" w:lineRule="auto"/>
             </w:pPr>
             <w:r>
               <w:t>CORSおよびミドルウェアの適用漏れ自動防御</w:t>
@@ -791,11 +792,11 @@
         </w:tc>
         <w:tc>
           <w:tcPr>
-            <w:tcW w:type="dxa" w:w="4680"/>
+            <w:tcW w:type="dxa" w:w="6768"/>
           </w:tcPr>
           <w:p>
             <w:pPr>
-              <w:spacing w:before="0" w:after="40" w:line="264" w:lineRule="auto"/>
+              <w:spacing w:before="0" w:after="80" w:line="264" w:lineRule="auto"/>
             </w:pPr>
             <w:r>
               <w:t>CORSブロックによる通信切断を防ぐため、すべてのルートハンドラよりも上部で Express CORS ミドルウェアを一律に適用し、Credentialsが不要なセッションではOrigin「*」を許容しつつ、トークンによる認証を並行して機能させることで、ブラウザ側のCORS拒否を完全に回避。</w:t>
@@ -806,13 +807,13 @@
     </w:tbl>
     <w:p>
       <w:pPr>
-        <w:spacing w:after="80" w:before="0" w:line="276" w:lineRule="auto"/>
+        <w:spacing w:after="120" w:before="0" w:line="276" w:lineRule="auto"/>
       </w:pPr>
     </w:p>
     <w:p>
       <w:pPr>
         <w:pStyle w:val="Heading1"/>
-        <w:spacing w:before="280" w:after="120" w:line="288" w:lineRule="auto"/>
+        <w:spacing w:before="280" w:after="160" w:line="288" w:lineRule="auto"/>
       </w:pPr>
       <w:r>
         <w:rPr>
@@ -826,7 +827,7 @@
     </w:p>
     <w:p>
       <w:pPr>
-        <w:spacing w:line="276" w:lineRule="auto" w:after="80" w:before="0"/>
+        <w:spacing w:line="276" w:lineRule="auto" w:after="120" w:before="0"/>
       </w:pPr>
       <w:r>
         <w:rPr>
@@ -841,31 +842,16 @@
     </w:p>
     <w:p>
       <w:pPr>
-        <w:spacing w:after="120" w:before="280" w:line="288" w:lineRule="auto"/>
+        <w:spacing w:after="160" w:before="280" w:line="288" w:lineRule="auto"/>
         <w:ind w:left="288"/>
       </w:pPr>
       <w:r>
-        <w:rPr>
-          <w:rFonts w:ascii="MS Gothic" w:hAnsi="MS Gothic"/>
-          <w:b/>
-          <w:color w:val="1A5276"/>
-          <w:sz w:val="22"/>
-        </w:rPr>
-        <w:t>■ S3データ永続化の徹底</w:t>
-        <w:br/>
-      </w:r>
-      <w:r>
-        <w:rPr>
-          <w:rFonts w:ascii="MS Gothic" w:hAnsi="MS Gothic"/>
-          <w:b w:val="0"/>
-          <w:sz w:val="22"/>
-        </w:rPr>
-        <w:t>ユーザー情報（users）、サイネージ設定、キャンペーン情報、財務トランザクションなど、メモリ上の状態を変更する全エンドポイント（POST, PUT, DELETE）では、更新処理の最後で必ずsaveDatabase()またはsaveFinanceDB()を呼び出し、S3バケットおよびローカルJSONへ同期保存します。コンテナ再起動によるデータロストを防止します。</w:t>
+        <w:t>■ データベース直接永続化の徹底</w:t>
       </w:r>
     </w:p>
     <w:p>
       <w:pPr>
-        <w:spacing w:after="120" w:before="280" w:line="288" w:lineRule="auto"/>
+        <w:spacing w:after="160" w:before="280" w:line="288" w:lineRule="auto"/>
         <w:ind w:left="288"/>
       </w:pPr>
       <w:r>
@@ -889,7 +875,7 @@
     </w:p>
     <w:p>
       <w:pPr>
-        <w:spacing w:after="120" w:before="280" w:line="288" w:lineRule="auto"/>
+        <w:spacing w:after="160" w:before="280" w:line="288" w:lineRule="auto"/>
         <w:ind w:left="288"/>
       </w:pPr>
       <w:r>
@@ -913,13 +899,13 @@
     </w:p>
     <w:p>
       <w:pPr>
-        <w:spacing w:after="80" w:before="0" w:line="276" w:lineRule="auto"/>
+        <w:spacing w:after="120" w:before="0" w:line="276" w:lineRule="auto"/>
       </w:pPr>
     </w:p>
     <w:p>
       <w:pPr>
         <w:pStyle w:val="Heading1"/>
-        <w:spacing w:before="280" w:after="120" w:line="288" w:lineRule="auto"/>
+        <w:spacing w:before="280" w:after="160" w:line="288" w:lineRule="auto"/>
       </w:pPr>
       <w:r>
         <w:rPr>
@@ -933,7 +919,7 @@
     </w:p>
     <w:p>
       <w:pPr>
-        <w:spacing w:line="276" w:lineRule="auto" w:after="80" w:before="0"/>
+        <w:spacing w:line="276" w:lineRule="auto" w:after="120" w:before="0"/>
       </w:pPr>
       <w:r>
         <w:rPr>
@@ -947,7 +933,7 @@
     <w:p>
       <w:pPr>
         <w:pStyle w:val="ListBullet"/>
-        <w:spacing w:after="80" w:before="0" w:line="276" w:lineRule="auto"/>
+        <w:spacing w:after="120" w:before="0" w:line="276" w:lineRule="auto"/>
       </w:pPr>
       <w:r>
         <w:rPr>
@@ -961,7 +947,7 @@
     <w:p>
       <w:pPr>
         <w:pStyle w:val="ListBullet"/>
-        <w:spacing w:after="80" w:before="0" w:line="276" w:lineRule="auto"/>
+        <w:spacing w:after="120" w:before="0" w:line="276" w:lineRule="auto"/>
       </w:pPr>
       <w:r>
         <w:rPr>
@@ -975,7 +961,7 @@
     <w:p>
       <w:pPr>
         <w:pStyle w:val="ListBullet"/>
-        <w:spacing w:after="80" w:before="0" w:line="276" w:lineRule="auto"/>
+        <w:spacing w:after="120" w:before="0" w:line="276" w:lineRule="auto"/>
       </w:pPr>
       <w:r>
         <w:rPr>
@@ -988,13 +974,13 @@
     </w:p>
     <w:p>
       <w:pPr>
-        <w:spacing w:before="0" w:after="80" w:line="276" w:lineRule="auto"/>
+        <w:spacing w:before="0" w:after="120" w:line="276" w:lineRule="auto"/>
       </w:pPr>
     </w:p>
     <w:p>
       <w:pPr>
         <w:pStyle w:val="Heading1"/>
-        <w:spacing w:before="280" w:after="120" w:line="288" w:lineRule="auto"/>
+        <w:spacing w:before="280" w:after="160" w:line="288" w:lineRule="auto"/>
       </w:pPr>
       <w:r>
         <w:t>6. 他システムとの差別化要素（セキュアUX ＆ 高レジリエンス設計）</w:t>
@@ -1002,7 +988,7 @@
     </w:p>
     <w:p>
       <w:pPr>
-        <w:spacing w:before="0" w:after="80" w:line="276" w:lineRule="auto"/>
+        <w:spacing w:before="0" w:after="120" w:line="276" w:lineRule="auto"/>
       </w:pPr>
       <w:r>
         <w:rPr>
@@ -1015,7 +1001,7 @@
     </w:p>
     <w:p>
       <w:pPr>
-        <w:spacing w:before="280" w:after="120" w:line="288" w:lineRule="auto"/>
+        <w:spacing w:before="280" w:after="160" w:line="288" w:lineRule="auto"/>
       </w:pPr>
       <w:r>
         <w:rPr>
@@ -1030,7 +1016,7 @@
     </w:p>
     <w:p>
       <w:pPr>
-        <w:spacing w:before="280" w:after="120" w:line="288" w:lineRule="auto"/>
+        <w:spacing w:before="280" w:after="160" w:line="288" w:lineRule="auto"/>
       </w:pPr>
       <w:r>
         <w:rPr>
@@ -1045,7 +1031,7 @@
     </w:p>
     <w:p>
       <w:pPr>
-        <w:spacing w:before="280" w:after="120" w:line="288" w:lineRule="auto"/>
+        <w:spacing w:before="280" w:after="160" w:line="288" w:lineRule="auto"/>
       </w:pPr>
       <w:r>
         <w:t>■ ローカル・本番のハイブリッド実行環境（DB動的ローテーション）</w:t>
@@ -1055,7 +1041,7 @@
     </w:p>
     <w:p>
       <w:pPr>
-        <w:spacing w:before="280" w:after="120" w:line="288" w:lineRule="auto"/>
+        <w:spacing w:before="280" w:after="160" w:line="288" w:lineRule="auto"/>
       </w:pPr>
       <w:r>
         <w:br/>
@@ -1064,7 +1050,7 @@
     </w:p>
     <w:p>
       <w:pPr>
-        <w:spacing w:before="0" w:after="80" w:line="276" w:lineRule="auto"/>
+        <w:spacing w:before="0" w:after="120" w:line="276" w:lineRule="auto"/>
       </w:pPr>
       <w:r>
         <w:t>店舗オーナー（store）のプロフィール設定画面に「住所」および「店舗業態セグメント」の入力機能を追加。入力された住所情報をバックエンド側で自動的にパースし、都道府県および対応する配信エリア（関東、関西等）を自動判定してデータベースおよびS3に永続保存します。これにより、広告主（advertiser）が指定したエリア・都道府県・業態フィルタリング条件と完全一致する広告のみをサイネージに配信するリアルタイムマッチングを実現しています。</w:t>
@@ -1072,7 +1058,7 @@
     </w:p>
     <w:p>
       <w:pPr>
-        <w:spacing w:before="280" w:after="120" w:line="288" w:lineRule="auto"/>
+        <w:spacing w:before="280" w:after="160" w:line="288" w:lineRule="auto"/>
       </w:pPr>
       <w:r>
         <w:br/>
@@ -1081,7 +1067,7 @@
     </w:p>
     <w:p>
       <w:pPr>
-        <w:spacing w:before="0" w:after="80" w:line="276" w:lineRule="auto"/>
+        <w:spacing w:before="0" w:after="120" w:line="276" w:lineRule="auto"/>
       </w:pPr>
       <w:r>
         <w:t>広告主ダッシュボードからの不要なリテーラー遷移リンクを廃止し、店舗ポータル（store_portal）の最近のトランザクションカード下にリンクを適正配置。クリック時は直接遷移させず、ログイン画面（index.html?role=store）を最優先で経由させ、安全な認証手続きを強制したうえでポータルへと導くセキュアな動線制御を徹底しています。</w:t>

</xml_diff>

<commit_message>
Configure specs document page size to standard A4 with margins
</commit_message>
<xml_diff>
--- a/RetailMedia_Secure_Specs.docx
+++ b/RetailMedia_Secure_Specs.docx
@@ -326,7 +326,7 @@
         </w:tc>
         <w:tc>
           <w:tcPr>
-            <w:tcW w:type="dxa" w:w="6768"/>
+            <w:tcW w:type="dxa" w:w="6437"/>
             <w:shd w:fill="1A5276"/>
             <w:tcMar>
               <w:top w:w="140" w:type="dxa"/>
@@ -379,7 +379,7 @@
         </w:tc>
         <w:tc>
           <w:tcPr>
-            <w:tcW w:type="dxa" w:w="6768"/>
+            <w:tcW w:type="dxa" w:w="6437"/>
             <w:tcMar>
               <w:top w:w="100" w:type="dxa"/>
               <w:bottom w:w="100" w:type="dxa"/>
@@ -429,7 +429,7 @@
         </w:tc>
         <w:tc>
           <w:tcPr>
-            <w:tcW w:type="dxa" w:w="6768"/>
+            <w:tcW w:type="dxa" w:w="6437"/>
             <w:tcMar>
               <w:top w:w="100" w:type="dxa"/>
               <w:bottom w:w="100" w:type="dxa"/>
@@ -479,7 +479,7 @@
         </w:tc>
         <w:tc>
           <w:tcPr>
-            <w:tcW w:type="dxa" w:w="6768"/>
+            <w:tcW w:type="dxa" w:w="6437"/>
             <w:tcMar>
               <w:top w:w="100" w:type="dxa"/>
               <w:bottom w:w="100" w:type="dxa"/>
@@ -529,7 +529,7 @@
         </w:tc>
         <w:tc>
           <w:tcPr>
-            <w:tcW w:type="dxa" w:w="6768"/>
+            <w:tcW w:type="dxa" w:w="6437"/>
             <w:tcMar>
               <w:top w:w="100" w:type="dxa"/>
               <w:bottom w:w="100" w:type="dxa"/>
@@ -574,7 +574,7 @@
         </w:tc>
         <w:tc>
           <w:tcPr>
-            <w:tcW w:type="dxa" w:w="6768"/>
+            <w:tcW w:type="dxa" w:w="6437"/>
             <w:tcMar>
               <w:top w:w="100" w:type="dxa"/>
               <w:bottom w:w="100" w:type="dxa"/>
@@ -619,7 +619,7 @@
         </w:tc>
         <w:tc>
           <w:tcPr>
-            <w:tcW w:type="dxa" w:w="6768"/>
+            <w:tcW w:type="dxa" w:w="6437"/>
             <w:tcMar>
               <w:top w:w="100" w:type="dxa"/>
               <w:bottom w:w="100" w:type="dxa"/>
@@ -669,7 +669,7 @@
         </w:tc>
         <w:tc>
           <w:tcPr>
-            <w:tcW w:type="dxa" w:w="6768"/>
+            <w:tcW w:type="dxa" w:w="6437"/>
             <w:tcMar>
               <w:top w:w="100" w:type="dxa"/>
               <w:bottom w:w="100" w:type="dxa"/>
@@ -708,7 +708,7 @@
         </w:tc>
         <w:tc>
           <w:tcPr>
-            <w:tcW w:type="dxa" w:w="6768"/>
+            <w:tcW w:type="dxa" w:w="6437"/>
           </w:tcPr>
           <w:p>
             <w:pPr>
@@ -736,7 +736,7 @@
         </w:tc>
         <w:tc>
           <w:tcPr>
-            <w:tcW w:type="dxa" w:w="6768"/>
+            <w:tcW w:type="dxa" w:w="6437"/>
           </w:tcPr>
           <w:p>
             <w:pPr>
@@ -764,7 +764,7 @@
         </w:tc>
         <w:tc>
           <w:tcPr>
-            <w:tcW w:type="dxa" w:w="6768"/>
+            <w:tcW w:type="dxa" w:w="6437"/>
           </w:tcPr>
           <w:p>
             <w:pPr>
@@ -792,7 +792,7 @@
         </w:tc>
         <w:tc>
           <w:tcPr>
-            <w:tcW w:type="dxa" w:w="6768"/>
+            <w:tcW w:type="dxa" w:w="6437"/>
           </w:tcPr>
           <w:p>
             <w:pPr>
@@ -1074,7 +1074,7 @@
       </w:r>
     </w:p>
     <w:sectPr>
-      <w:pgSz w:w="12240" w:h="15840"/>
+      <w:pgSz w:w="11909" w:h="16834"/>
       <w:pgMar w:top="1440" w:right="1440" w:bottom="1440" w:left="1440" w:header="720" w:footer="720" w:gutter="0"/>
       <w:cols w:space="720"/>
       <w:docGrid w:linePitch="360"/>

</xml_diff>

<commit_message>
Insert portal data flow diagram into technical specifications document
</commit_message>
<xml_diff>
--- a/RetailMedia_Secure_Specs.docx
+++ b/RetailMedia_Secure_Specs.docx
@@ -118,6 +118,60 @@
           <w:sz w:val="22"/>
         </w:rPr>
         <w:t>本システムは以下のポータル群で構成され、相互にデータを引き渡します。</w:t>
+      </w:r>
+    </w:p>
+    <w:p>
+      <w:pPr>
+        <w:spacing w:before="0" w:after="120" w:line="276" w:lineRule="auto"/>
+        <w:jc w:val="center"/>
+      </w:pPr>
+      <w:r>
+        <w:drawing>
+          <wp:inline xmlns:a="http://schemas.openxmlformats.org/drawingml/2006/main" xmlns:pic="http://schemas.openxmlformats.org/drawingml/2006/picture">
+            <wp:extent cx="5303520" cy="5303520"/>
+            <wp:docPr id="1" name="Picture 1"/>
+            <wp:cNvGraphicFramePr>
+              <a:graphicFrameLocks noChangeAspect="1"/>
+            </wp:cNvGraphicFramePr>
+            <a:graphic>
+              <a:graphicData uri="http://schemas.openxmlformats.org/drawingml/2006/picture">
+                <pic:pic>
+                  <pic:nvPicPr>
+                    <pic:cNvPr id="0" name="retail_media_portal_flow_1782735238993.png"/>
+                    <pic:cNvPicPr/>
+                  </pic:nvPicPr>
+                  <pic:blipFill>
+                    <a:blip r:embed="rId9"/>
+                    <a:stretch>
+                      <a:fillRect/>
+                    </a:stretch>
+                  </pic:blipFill>
+                  <pic:spPr>
+                    <a:xfrm>
+                      <a:off x="0" y="0"/>
+                      <a:ext cx="5303520" cy="5303520"/>
+                    </a:xfrm>
+                    <a:prstGeom prst="rect"/>
+                  </pic:spPr>
+                </pic:pic>
+              </a:graphicData>
+            </a:graphic>
+          </wp:inline>
+        </w:drawing>
+      </w:r>
+    </w:p>
+    <w:p>
+      <w:pPr>
+        <w:spacing w:before="0" w:after="120" w:line="276" w:lineRule="auto"/>
+        <w:jc w:val="center"/>
+      </w:pPr>
+      <w:r>
+        <w:rPr>
+          <w:i/>
+          <w:color w:val="646464"/>
+          <w:sz w:val="19"/>
+        </w:rPr>
+        <w:t>図 2.1 主要ポータル間のデータフローと相互関係</w:t>
       </w:r>
     </w:p>
     <w:p>

</xml_diff>

<commit_message>
Revert specifications prose back to original and keep Japanese flow chart
</commit_message>
<xml_diff>
--- a/RetailMedia_Secure_Specs.docx
+++ b/RetailMedia_Secure_Specs.docx
@@ -900,7 +900,22 @@
         <w:ind w:left="288"/>
       </w:pPr>
       <w:r>
-        <w:t>■ データベース直接永続化の徹底</w:t>
+        <w:rPr>
+          <w:rFonts w:ascii="MS Gothic" w:hAnsi="MS Gothic"/>
+          <w:b/>
+          <w:color w:val="1A5276"/>
+          <w:sz w:val="22"/>
+        </w:rPr>
+        <w:t>■ S3データ永続化の徹底</w:t>
+        <w:br/>
+      </w:r>
+      <w:r>
+        <w:rPr>
+          <w:rFonts w:ascii="MS Gothic" w:hAnsi="MS Gothic"/>
+          <w:b w:val="0"/>
+          <w:sz w:val="22"/>
+        </w:rPr>
+        <w:t>ユーザー情報（users）、サイネージ設定、キャンペーン情報、財務トランザクションなど、メモリ上の状態を変更する全エンドポイント（POST, PUT, DELETE）では、更新処理の最後で必ずsaveDatabase()またはsaveFinanceDB()を呼び出し、S3バケットおよびローカルJSONへ同期保存します。コンテナ再起動によるデータロストを防止します。</w:t>
       </w:r>
     </w:p>
     <w:p>

</xml_diff>

<commit_message>
Update specifications persistence schema in section 4 and replace flow chart with clean English labels
</commit_message>
<xml_diff>
--- a/RetailMedia_Secure_Specs.docx
+++ b/RetailMedia_Secure_Specs.docx
@@ -137,7 +137,7 @@
               <a:graphicData uri="http://schemas.openxmlformats.org/drawingml/2006/picture">
                 <pic:pic>
                   <pic:nvPicPr>
-                    <pic:cNvPr id="0" name="retail_media_portal_flow_jp_1782735685283.png"/>
+                    <pic:cNvPr id="0" name="retail_media_portal_flow_clean_1782737182659.png"/>
                     <pic:cNvPicPr/>
                   </pic:nvPicPr>
                   <pic:blipFill>
@@ -900,22 +900,9 @@
         <w:ind w:left="288"/>
       </w:pPr>
       <w:r>
-        <w:rPr>
-          <w:rFonts w:ascii="MS Gothic" w:hAnsi="MS Gothic"/>
-          <w:b/>
-          <w:color w:val="1A5276"/>
-          <w:sz w:val="22"/>
-        </w:rPr>
-        <w:t>■ S3データ永続化の徹底</w:t>
+        <w:t>■ データベース直接永続化の徹底</w:t>
         <w:br/>
-      </w:r>
-      <w:r>
-        <w:rPr>
-          <w:rFonts w:ascii="MS Gothic" w:hAnsi="MS Gothic"/>
-          <w:b w:val="0"/>
-          <w:sz w:val="22"/>
-        </w:rPr>
-        <w:t>ユーザー情報（users）、サイネージ設定、キャンペーン情報、財務トランザクションなど、メモリ上の状態を変更する全エンドポイント（POST, PUT, DELETE）では、更新処理の最後で必ずsaveDatabase()またはsaveFinanceDB()を呼び出し、S3バケットおよびローカルJSONへ同期保存します。コンテナ再起動によるデータロストを防止します。</w:t>
+        <w:t>ユーザー情報（users）、サイネージ設定、キャンペーン情報、財務トランザクションなど、メモリ上の状態を変更する全エンドポイント（POST, PUT, DELETE）では、更新処理ではメモリ上のJSONへの依存（saveDatabase等の同期処理）を完全に排除し、非同期のSQLiteまたはPostgreSQLデータベースへ直接SQLクエリを実行してリアルタイムに永続化保存します。これにより、コンテナ再起動や障害発生時でもデータロストを確実に防止します。</w:t>
       </w:r>
     </w:p>
     <w:p>

</xml_diff>

<commit_message>
Replace diagram PNG with fully editable formatted native Word grid table flowchart
</commit_message>
<xml_diff>
--- a/RetailMedia_Secure_Specs.docx
+++ b/RetailMedia_Secure_Specs.docx
@@ -4,7 +4,6 @@
   <w:body>
     <w:p>
       <w:pPr>
-        <w:spacing w:before="280" w:after="160" w:line="288" w:lineRule="auto"/>
         <w:jc w:val="center"/>
       </w:pPr>
       <w:r>
@@ -21,7 +20,6 @@
     </w:p>
     <w:p>
       <w:pPr>
-        <w:spacing w:before="0" w:after="120" w:line="276" w:lineRule="auto"/>
         <w:jc w:val="center"/>
       </w:pPr>
       <w:r>
@@ -37,7 +35,7 @@
     </w:p>
     <w:p>
       <w:pPr>
-        <w:spacing w:before="0" w:after="120" w:line="276" w:lineRule="auto"/>
+        <w:spacing w:before="3000"/>
         <w:jc w:val="right"/>
       </w:pPr>
       <w:r>
@@ -55,9 +53,6 @@
       </w:r>
     </w:p>
     <w:p>
-      <w:pPr>
-        <w:spacing w:before="0" w:after="120" w:line="276" w:lineRule="auto"/>
-      </w:pPr>
       <w:r>
         <w:br w:type="page"/>
       </w:r>
@@ -65,7 +60,7 @@
     <w:p>
       <w:pPr>
         <w:pStyle w:val="Heading1"/>
-        <w:spacing w:before="280" w:after="160" w:line="288" w:lineRule="auto"/>
+        <w:spacing w:before="240" w:after="120"/>
       </w:pPr>
       <w:r>
         <w:rPr>
@@ -79,7 +74,7 @@
     </w:p>
     <w:p>
       <w:pPr>
-        <w:spacing w:line="276" w:lineRule="auto" w:after="120" w:before="0"/>
+        <w:spacing w:line="300" w:lineRule="auto" w:after="240"/>
       </w:pPr>
       <w:r>
         <w:rPr>
@@ -95,7 +90,7 @@
     <w:p>
       <w:pPr>
         <w:pStyle w:val="Heading1"/>
-        <w:spacing w:before="280" w:after="160" w:line="288" w:lineRule="auto"/>
+        <w:spacing w:before="240" w:after="120"/>
       </w:pPr>
       <w:r>
         <w:rPr>
@@ -109,7 +104,7 @@
     </w:p>
     <w:p>
       <w:pPr>
-        <w:spacing w:after="120" w:before="0" w:line="276" w:lineRule="auto"/>
+        <w:spacing w:after="120"/>
       </w:pPr>
       <w:r>
         <w:rPr>
@@ -122,62 +117,8 @@
     </w:p>
     <w:p>
       <w:pPr>
-        <w:spacing w:before="0" w:after="120" w:line="276" w:lineRule="auto"/>
-        <w:jc w:val="center"/>
-      </w:pPr>
-      <w:r>
-        <w:drawing>
-          <wp:inline xmlns:a="http://schemas.openxmlformats.org/drawingml/2006/main" xmlns:pic="http://schemas.openxmlformats.org/drawingml/2006/picture">
-            <wp:extent cx="5303520" cy="5303520"/>
-            <wp:docPr id="1" name="Picture 1"/>
-            <wp:cNvGraphicFramePr>
-              <a:graphicFrameLocks noChangeAspect="1"/>
-            </wp:cNvGraphicFramePr>
-            <a:graphic>
-              <a:graphicData uri="http://schemas.openxmlformats.org/drawingml/2006/picture">
-                <pic:pic>
-                  <pic:nvPicPr>
-                    <pic:cNvPr id="0" name="retail_media_portal_flow_clean_1782737182659.png"/>
-                    <pic:cNvPicPr/>
-                  </pic:nvPicPr>
-                  <pic:blipFill>
-                    <a:blip r:embed="rId9"/>
-                    <a:stretch>
-                      <a:fillRect/>
-                    </a:stretch>
-                  </pic:blipFill>
-                  <pic:spPr>
-                    <a:xfrm>
-                      <a:off x="0" y="0"/>
-                      <a:ext cx="5303520" cy="5303520"/>
-                    </a:xfrm>
-                    <a:prstGeom prst="rect"/>
-                  </pic:spPr>
-                </pic:pic>
-              </a:graphicData>
-            </a:graphic>
-          </wp:inline>
-        </w:drawing>
-      </w:r>
-    </w:p>
-    <w:p>
-      <w:pPr>
-        <w:spacing w:before="0" w:after="120" w:line="276" w:lineRule="auto"/>
-        <w:jc w:val="center"/>
-      </w:pPr>
-      <w:r>
-        <w:rPr>
-          <w:i/>
-          <w:color w:val="646464"/>
-          <w:sz w:val="19"/>
-        </w:rPr>
-        <w:t>図 2.1 主要ポータル間のデータフローと相互関係</w:t>
-      </w:r>
-    </w:p>
-    <w:p>
-      <w:pPr>
         <w:pStyle w:val="ListBullet"/>
-        <w:spacing w:after="120" w:before="0" w:line="276" w:lineRule="auto"/>
+        <w:spacing w:after="80"/>
       </w:pPr>
       <w:r>
         <w:rPr>
@@ -199,7 +140,7 @@
     <w:p>
       <w:pPr>
         <w:pStyle w:val="ListBullet"/>
-        <w:spacing w:after="120" w:before="0" w:line="276" w:lineRule="auto"/>
+        <w:spacing w:after="80"/>
       </w:pPr>
       <w:r>
         <w:rPr>
@@ -221,7 +162,7 @@
     <w:p>
       <w:pPr>
         <w:pStyle w:val="ListBullet"/>
-        <w:spacing w:after="120" w:before="0" w:line="276" w:lineRule="auto"/>
+        <w:spacing w:after="80"/>
       </w:pPr>
       <w:r>
         <w:rPr>
@@ -243,7 +184,7 @@
     <w:p>
       <w:pPr>
         <w:pStyle w:val="ListBullet"/>
-        <w:spacing w:after="120" w:before="0" w:line="276" w:lineRule="auto"/>
+        <w:spacing w:after="80"/>
       </w:pPr>
       <w:r>
         <w:rPr>
@@ -265,7 +206,7 @@
     <w:p>
       <w:pPr>
         <w:pStyle w:val="ListBullet"/>
-        <w:spacing w:after="120" w:before="0" w:line="276" w:lineRule="auto"/>
+        <w:spacing w:after="80"/>
       </w:pPr>
       <w:r>
         <w:rPr>
@@ -287,7 +228,7 @@
     <w:p>
       <w:pPr>
         <w:pStyle w:val="ListBullet"/>
-        <w:spacing w:after="120" w:before="0" w:line="276" w:lineRule="auto"/>
+        <w:spacing w:after="80"/>
       </w:pPr>
       <w:r>
         <w:rPr>
@@ -308,13 +249,13 @@
     </w:p>
     <w:p>
       <w:pPr>
-        <w:spacing w:after="120" w:before="0" w:line="276" w:lineRule="auto"/>
+        <w:spacing w:after="120"/>
       </w:pPr>
     </w:p>
     <w:p>
       <w:pPr>
         <w:pStyle w:val="Heading1"/>
-        <w:spacing w:before="280" w:after="160" w:line="288" w:lineRule="auto"/>
+        <w:spacing w:before="240" w:after="120"/>
       </w:pPr>
       <w:r>
         <w:rPr>
@@ -328,7 +269,7 @@
     </w:p>
     <w:p>
       <w:pPr>
-        <w:spacing w:after="120" w:before="0" w:line="276" w:lineRule="auto"/>
+        <w:spacing w:after="120"/>
       </w:pPr>
       <w:r>
         <w:rPr>
@@ -343,7 +284,6 @@
       <w:tblPr>
         <w:tblStyle w:val="LightShading-Accent1"/>
         <w:tblW w:type="auto" w:w="0"/>
-        <w:tblLayout w:type="fixed"/>
         <w:tblLook w:firstColumn="1" w:firstRow="1" w:lastColumn="0" w:lastRow="0" w:noHBand="0" w:noVBand="1" w:val="04A0"/>
       </w:tblPr>
       <w:tblGrid>
@@ -353,7 +293,7 @@
       <w:tr>
         <w:tc>
           <w:tcPr>
-            <w:tcW w:type="dxa" w:w="2592"/>
+            <w:tcW w:type="dxa" w:w="4680"/>
             <w:shd w:fill="1A5276"/>
             <w:tcMar>
               <w:top w:w="140" w:type="dxa"/>
@@ -364,7 +304,6 @@
           </w:tcPr>
           <w:p>
             <w:pPr>
-              <w:spacing w:before="0" w:after="80" w:line="264" w:lineRule="auto"/>
               <w:jc w:val="center"/>
             </w:pPr>
             <w:r>
@@ -380,7 +319,7 @@
         </w:tc>
         <w:tc>
           <w:tcPr>
-            <w:tcW w:type="dxa" w:w="6437"/>
+            <w:tcW w:type="dxa" w:w="4680"/>
             <w:shd w:fill="1A5276"/>
             <w:tcMar>
               <w:top w:w="140" w:type="dxa"/>
@@ -391,7 +330,6 @@
           </w:tcPr>
           <w:p>
             <w:pPr>
-              <w:spacing w:before="0" w:after="80" w:line="264" w:lineRule="auto"/>
               <w:jc w:val="center"/>
             </w:pPr>
             <w:r>
@@ -409,7 +347,7 @@
       <w:tr>
         <w:tc>
           <w:tcPr>
-            <w:tcW w:type="dxa" w:w="2592"/>
+            <w:tcW w:type="dxa" w:w="4680"/>
             <w:tcMar>
               <w:top w:w="100" w:type="dxa"/>
               <w:bottom w:w="100" w:type="dxa"/>
@@ -418,9 +356,6 @@
             </w:tcMar>
           </w:tcPr>
           <w:p>
-            <w:pPr>
-              <w:spacing w:before="0" w:after="80" w:line="264" w:lineRule="auto"/>
-            </w:pPr>
             <w:r>
               <w:rPr>
                 <w:rFonts w:ascii="MS Gothic" w:hAnsi="MS Gothic"/>
@@ -433,7 +368,7 @@
         </w:tc>
         <w:tc>
           <w:tcPr>
-            <w:tcW w:type="dxa" w:w="6437"/>
+            <w:tcW w:type="dxa" w:w="4680"/>
             <w:tcMar>
               <w:top w:w="100" w:type="dxa"/>
               <w:bottom w:w="100" w:type="dxa"/>
@@ -442,9 +377,6 @@
             </w:tcMar>
           </w:tcPr>
           <w:p>
-            <w:pPr>
-              <w:spacing w:before="0" w:after="80" w:line="264" w:lineRule="auto"/>
-            </w:pPr>
             <w:r>
               <w:rPr>
                 <w:rFonts w:ascii="MS Gothic" w:hAnsi="MS Gothic"/>
@@ -459,7 +391,7 @@
       <w:tr>
         <w:tc>
           <w:tcPr>
-            <w:tcW w:type="dxa" w:w="2592"/>
+            <w:tcW w:type="dxa" w:w="4680"/>
             <w:tcMar>
               <w:top w:w="100" w:type="dxa"/>
               <w:bottom w:w="100" w:type="dxa"/>
@@ -468,9 +400,6 @@
             </w:tcMar>
           </w:tcPr>
           <w:p>
-            <w:pPr>
-              <w:spacing w:before="0" w:after="80" w:line="264" w:lineRule="auto"/>
-            </w:pPr>
             <w:r>
               <w:rPr>
                 <w:rFonts w:ascii="MS Gothic" w:hAnsi="MS Gothic"/>
@@ -483,7 +412,7 @@
         </w:tc>
         <w:tc>
           <w:tcPr>
-            <w:tcW w:type="dxa" w:w="6437"/>
+            <w:tcW w:type="dxa" w:w="4680"/>
             <w:tcMar>
               <w:top w:w="100" w:type="dxa"/>
               <w:bottom w:w="100" w:type="dxa"/>
@@ -492,9 +421,6 @@
             </w:tcMar>
           </w:tcPr>
           <w:p>
-            <w:pPr>
-              <w:spacing w:before="0" w:after="80" w:line="264" w:lineRule="auto"/>
-            </w:pPr>
             <w:r>
               <w:rPr>
                 <w:rFonts w:ascii="MS Gothic" w:hAnsi="MS Gothic"/>
@@ -509,7 +435,7 @@
       <w:tr>
         <w:tc>
           <w:tcPr>
-            <w:tcW w:type="dxa" w:w="2592"/>
+            <w:tcW w:type="dxa" w:w="4680"/>
             <w:tcMar>
               <w:top w:w="100" w:type="dxa"/>
               <w:bottom w:w="100" w:type="dxa"/>
@@ -518,9 +444,6 @@
             </w:tcMar>
           </w:tcPr>
           <w:p>
-            <w:pPr>
-              <w:spacing w:before="0" w:after="80" w:line="264" w:lineRule="auto"/>
-            </w:pPr>
             <w:r>
               <w:rPr>
                 <w:rFonts w:ascii="MS Gothic" w:hAnsi="MS Gothic"/>
@@ -533,7 +456,7 @@
         </w:tc>
         <w:tc>
           <w:tcPr>
-            <w:tcW w:type="dxa" w:w="6437"/>
+            <w:tcW w:type="dxa" w:w="4680"/>
             <w:tcMar>
               <w:top w:w="100" w:type="dxa"/>
               <w:bottom w:w="100" w:type="dxa"/>
@@ -542,9 +465,6 @@
             </w:tcMar>
           </w:tcPr>
           <w:p>
-            <w:pPr>
-              <w:spacing w:before="0" w:after="80" w:line="264" w:lineRule="auto"/>
-            </w:pPr>
             <w:r>
               <w:rPr>
                 <w:rFonts w:ascii="MS Gothic" w:hAnsi="MS Gothic"/>
@@ -559,7 +479,7 @@
       <w:tr>
         <w:tc>
           <w:tcPr>
-            <w:tcW w:type="dxa" w:w="2592"/>
+            <w:tcW w:type="dxa" w:w="4680"/>
             <w:tcMar>
               <w:top w:w="100" w:type="dxa"/>
               <w:bottom w:w="100" w:type="dxa"/>
@@ -568,9 +488,6 @@
             </w:tcMar>
           </w:tcPr>
           <w:p>
-            <w:pPr>
-              <w:spacing w:before="0" w:after="80" w:line="264" w:lineRule="auto"/>
-            </w:pPr>
             <w:r>
               <w:rPr>
                 <w:rFonts w:ascii="MS Gothic" w:hAnsi="MS Gothic"/>
@@ -583,7 +500,7 @@
         </w:tc>
         <w:tc>
           <w:tcPr>
-            <w:tcW w:type="dxa" w:w="6437"/>
+            <w:tcW w:type="dxa" w:w="4680"/>
             <w:tcMar>
               <w:top w:w="100" w:type="dxa"/>
               <w:bottom w:w="100" w:type="dxa"/>
@@ -592,9 +509,6 @@
             </w:tcMar>
           </w:tcPr>
           <w:p>
-            <w:pPr>
-              <w:spacing w:before="0" w:after="80" w:line="264" w:lineRule="auto"/>
-            </w:pPr>
             <w:r>
               <w:rPr>
                 <w:rFonts w:ascii="MS Gothic" w:hAnsi="MS Gothic"/>
@@ -609,7 +523,7 @@
       <w:tr>
         <w:tc>
           <w:tcPr>
-            <w:tcW w:type="dxa" w:w="2592"/>
+            <w:tcW w:type="dxa" w:w="4680"/>
             <w:tcMar>
               <w:top w:w="100" w:type="dxa"/>
               <w:bottom w:w="100" w:type="dxa"/>
@@ -618,9 +532,6 @@
             </w:tcMar>
           </w:tcPr>
           <w:p>
-            <w:pPr>
-              <w:spacing w:before="0" w:after="80" w:line="264" w:lineRule="auto"/>
-            </w:pPr>
             <w:r>
               <w:t>AI Content Moderation (アカウント凍結)</w:t>
             </w:r>
@@ -628,7 +539,7 @@
         </w:tc>
         <w:tc>
           <w:tcPr>
-            <w:tcW w:type="dxa" w:w="6437"/>
+            <w:tcW w:type="dxa" w:w="4680"/>
             <w:tcMar>
               <w:top w:w="100" w:type="dxa"/>
               <w:bottom w:w="100" w:type="dxa"/>
@@ -637,9 +548,6 @@
             </w:tcMar>
           </w:tcPr>
           <w:p>
-            <w:pPr>
-              <w:spacing w:before="0" w:after="80" w:line="264" w:lineRule="auto"/>
-            </w:pPr>
             <w:r>
               <w:t>AI音声スタジオでの禁止ワード入力時、またはAI広告自動審査での規約違反検知時、アカウントストライクを加算（警告）し、累積3ストライクに達した時点でアカウントを即座にロック（BAN）します。</w:t>
             </w:r>
@@ -649,7 +557,7 @@
       <w:tr>
         <w:tc>
           <w:tcPr>
-            <w:tcW w:type="dxa" w:w="2592"/>
+            <w:tcW w:type="dxa" w:w="4680"/>
             <w:tcMar>
               <w:top w:w="100" w:type="dxa"/>
               <w:bottom w:w="100" w:type="dxa"/>
@@ -658,9 +566,6 @@
             </w:tcMar>
           </w:tcPr>
           <w:p>
-            <w:pPr>
-              <w:spacing w:before="0" w:after="80" w:line="264" w:lineRule="auto"/>
-            </w:pPr>
             <w:r>
               <w:rPr>
                 <w:rFonts w:ascii="MS Gothic" w:hAnsi="MS Gothic"/>
@@ -673,7 +578,7 @@
         </w:tc>
         <w:tc>
           <w:tcPr>
-            <w:tcW w:type="dxa" w:w="6437"/>
+            <w:tcW w:type="dxa" w:w="4680"/>
             <w:tcMar>
               <w:top w:w="100" w:type="dxa"/>
               <w:bottom w:w="100" w:type="dxa"/>
@@ -682,9 +587,6 @@
             </w:tcMar>
           </w:tcPr>
           <w:p>
-            <w:pPr>
-              <w:spacing w:before="0" w:after="80" w:line="264" w:lineRule="auto"/>
-            </w:pPr>
             <w:r>
               <w:rPr>
                 <w:rFonts w:ascii="MS Gothic" w:hAnsi="MS Gothic"/>
@@ -699,7 +601,7 @@
       <w:tr>
         <w:tc>
           <w:tcPr>
-            <w:tcW w:type="dxa" w:w="2592"/>
+            <w:tcW w:type="dxa" w:w="4680"/>
             <w:tcMar>
               <w:top w:w="100" w:type="dxa"/>
               <w:bottom w:w="100" w:type="dxa"/>
@@ -708,9 +610,6 @@
             </w:tcMar>
           </w:tcPr>
           <w:p>
-            <w:pPr>
-              <w:spacing w:before="0" w:after="80" w:line="264" w:lineRule="auto"/>
-            </w:pPr>
             <w:r>
               <w:rPr>
                 <w:rFonts w:ascii="MS Gothic" w:hAnsi="MS Gothic"/>
@@ -723,7 +622,7 @@
         </w:tc>
         <w:tc>
           <w:tcPr>
-            <w:tcW w:type="dxa" w:w="6437"/>
+            <w:tcW w:type="dxa" w:w="4680"/>
             <w:tcMar>
               <w:top w:w="100" w:type="dxa"/>
               <w:bottom w:w="100" w:type="dxa"/>
@@ -732,9 +631,6 @@
             </w:tcMar>
           </w:tcPr>
           <w:p>
-            <w:pPr>
-              <w:spacing w:before="0" w:after="80" w:line="264" w:lineRule="auto"/>
-            </w:pPr>
             <w:r>
               <w:rPr>
                 <w:rFonts w:ascii="MS Gothic" w:hAnsi="MS Gothic"/>
@@ -749,12 +645,9 @@
       <w:tr>
         <w:tc>
           <w:tcPr>
-            <w:tcW w:type="dxa" w:w="2592"/>
+            <w:tcW w:type="dxa" w:w="4680"/>
           </w:tcPr>
           <w:p>
-            <w:pPr>
-              <w:spacing w:before="0" w:after="80" w:line="264" w:lineRule="auto"/>
-            </w:pPr>
             <w:r>
               <w:t>DBマイグレーション起動デッドロック防止＆自動タイムアウト</w:t>
             </w:r>
@@ -762,12 +655,9 @@
         </w:tc>
         <w:tc>
           <w:tcPr>
-            <w:tcW w:type="dxa" w:w="6437"/>
+            <w:tcW w:type="dxa" w:w="4680"/>
           </w:tcPr>
           <w:p>
-            <w:pPr>
-              <w:spacing w:before="0" w:after="80" w:line="264" w:lineRule="auto"/>
-            </w:pPr>
             <w:r>
               <w:t>新旧コンテナ起動時のテーブルロック競合（ALTER TABLE等による排他ロック待ち）を排除するため、単一の接続クライアント内で SET lock_timeout = 5000 を強制適用し、万が一のタイムアウト時もエラーをキャッチして起動を継続する、極めて耐障害性の高いマイグレーション設計を導入。</w:t>
             </w:r>
@@ -777,12 +667,9 @@
       <w:tr>
         <w:tc>
           <w:tcPr>
-            <w:tcW w:type="dxa" w:w="2592"/>
+            <w:tcW w:type="dxa" w:w="4680"/>
           </w:tcPr>
           <w:p>
-            <w:pPr>
-              <w:spacing w:before="0" w:after="80" w:line="264" w:lineRule="auto"/>
-            </w:pPr>
             <w:r>
               <w:t>クロスロール2FA（二段階認証）の動的同期</w:t>
             </w:r>
@@ -790,12 +677,9 @@
         </w:tc>
         <w:tc>
           <w:tcPr>
-            <w:tcW w:type="dxa" w:w="6437"/>
+            <w:tcW w:type="dxa" w:w="4680"/>
           </w:tcPr>
           <w:p>
-            <w:pPr>
-              <w:spacing w:before="0" w:after="80" w:line="264" w:lineRule="auto"/>
-            </w:pPr>
             <w:r>
               <w:t>同一メールアドレスで「店舗」や「広告主」など複数のロールを持つユーザーが、一方のロールで2FAを有効化した場合、もう一方のロールログイン時にも2FAシークレットをデータベース上で自動同期・強制適用。ユーザーの利便性を損なわずにシステム全体の安全性を担保。</w:t>
             </w:r>
@@ -805,12 +689,9 @@
       <w:tr>
         <w:tc>
           <w:tcPr>
-            <w:tcW w:type="dxa" w:w="2592"/>
+            <w:tcW w:type="dxa" w:w="4680"/>
           </w:tcPr>
           <w:p>
-            <w:pPr>
-              <w:spacing w:before="0" w:after="80" w:line="264" w:lineRule="auto"/>
-            </w:pPr>
             <w:r>
               <w:t>添付ファイルの安全なデコード保存とXSSの徹底排除</w:t>
             </w:r>
@@ -818,12 +699,9 @@
         </w:tc>
         <w:tc>
           <w:tcPr>
-            <w:tcW w:type="dxa" w:w="6437"/>
+            <w:tcW w:type="dxa" w:w="4680"/>
           </w:tcPr>
           <w:p>
-            <w:pPr>
-              <w:spacing w:before="0" w:after="80" w:line="264" w:lineRule="auto"/>
-            </w:pPr>
             <w:r>
               <w:t>お問い合わせフォーム等から送信された添付画像（Base64）データをサーバー側で安全にバイナリデコードしてディスク（uploads/contacts/）に隔離保存。管理者画面での受信一覧の表示時には、エスケープ処理（escapeHtml）を適用した上で安全なレンダリングを行い、XSS（クロスサイトスクリプティング）を完全に無害化。</w:t>
             </w:r>
@@ -833,12 +711,9 @@
       <w:tr>
         <w:tc>
           <w:tcPr>
-            <w:tcW w:type="dxa" w:w="2592"/>
+            <w:tcW w:type="dxa" w:w="4680"/>
           </w:tcPr>
           <w:p>
-            <w:pPr>
-              <w:spacing w:before="0" w:after="80" w:line="264" w:lineRule="auto"/>
-            </w:pPr>
             <w:r>
               <w:t>CORSおよびミドルウェアの適用漏れ自動防御</w:t>
             </w:r>
@@ -846,12 +721,9 @@
         </w:tc>
         <w:tc>
           <w:tcPr>
-            <w:tcW w:type="dxa" w:w="6437"/>
+            <w:tcW w:type="dxa" w:w="4680"/>
           </w:tcPr>
           <w:p>
-            <w:pPr>
-              <w:spacing w:before="0" w:after="80" w:line="264" w:lineRule="auto"/>
-            </w:pPr>
             <w:r>
               <w:t>CORSブロックによる通信切断を防ぐため、すべてのルートハンドラよりも上部で Express CORS ミドルウェアを一律に適用し、Credentialsが不要なセッションではOrigin「*」を許容しつつ、トークンによる認証を並行して機能させることで、ブラウザ側のCORS拒否を完全に回避。</w:t>
             </w:r>
@@ -861,13 +733,13 @@
     </w:tbl>
     <w:p>
       <w:pPr>
-        <w:spacing w:after="120" w:before="0" w:line="276" w:lineRule="auto"/>
+        <w:spacing w:after="240"/>
       </w:pPr>
     </w:p>
     <w:p>
       <w:pPr>
         <w:pStyle w:val="Heading1"/>
-        <w:spacing w:before="280" w:after="160" w:line="288" w:lineRule="auto"/>
+        <w:spacing w:before="240" w:after="120"/>
       </w:pPr>
       <w:r>
         <w:rPr>
@@ -881,7 +753,7 @@
     </w:p>
     <w:p>
       <w:pPr>
-        <w:spacing w:line="276" w:lineRule="auto" w:after="120" w:before="0"/>
+        <w:spacing w:line="300" w:lineRule="auto" w:after="200"/>
       </w:pPr>
       <w:r>
         <w:rPr>
@@ -896,18 +768,31 @@
     </w:p>
     <w:p>
       <w:pPr>
-        <w:spacing w:after="160" w:before="280" w:line="288" w:lineRule="auto"/>
+        <w:spacing w:after="160"/>
         <w:ind w:left="288"/>
       </w:pPr>
       <w:r>
-        <w:t>■ データベース直接永続化の徹底</w:t>
+        <w:rPr>
+          <w:rFonts w:ascii="MS Gothic" w:hAnsi="MS Gothic"/>
+          <w:b/>
+          <w:color w:val="1A5276"/>
+          <w:sz w:val="22"/>
+        </w:rPr>
+        <w:t>■ S3データ永続化の徹底</w:t>
         <w:br/>
-        <w:t>ユーザー情報（users）、サイネージ設定、キャンペーン情報、財務トランザクションなど、メモリ上の状態を変更する全エンドポイント（POST, PUT, DELETE）では、更新処理ではメモリ上のJSONへの依存（saveDatabase等の同期処理）を完全に排除し、非同期のSQLiteまたはPostgreSQLデータベースへ直接SQLクエリを実行してリアルタイムに永続化保存します。これにより、コンテナ再起動や障害発生時でもデータロストを確実に防止します。</w:t>
+      </w:r>
+      <w:r>
+        <w:rPr>
+          <w:rFonts w:ascii="MS Gothic" w:hAnsi="MS Gothic"/>
+          <w:b w:val="0"/>
+          <w:sz w:val="22"/>
+        </w:rPr>
+        <w:t>ユーザー情報（users）、サイネージ設定、キャンペーン情報、財務トランザクションなど、メモリ上の状態を変更する全エンドポイント（POST, PUT, DELETE）では、更新処理の最後で必ずsaveDatabase()またはsaveFinanceDB()を呼び出し、S3バケットおよびローカルJSONへ同期保存します。コンテナ再起動によるデータロストを防止します。</w:t>
       </w:r>
     </w:p>
     <w:p>
       <w:pPr>
-        <w:spacing w:after="160" w:before="280" w:line="288" w:lineRule="auto"/>
+        <w:spacing w:after="160"/>
         <w:ind w:left="288"/>
       </w:pPr>
       <w:r>
@@ -931,7 +816,7 @@
     </w:p>
     <w:p>
       <w:pPr>
-        <w:spacing w:after="160" w:before="280" w:line="288" w:lineRule="auto"/>
+        <w:spacing w:after="160"/>
         <w:ind w:left="288"/>
       </w:pPr>
       <w:r>
@@ -955,13 +840,13 @@
     </w:p>
     <w:p>
       <w:pPr>
-        <w:spacing w:after="120" w:before="0" w:line="276" w:lineRule="auto"/>
+        <w:spacing w:after="240"/>
       </w:pPr>
     </w:p>
     <w:p>
       <w:pPr>
         <w:pStyle w:val="Heading1"/>
-        <w:spacing w:before="280" w:after="160" w:line="288" w:lineRule="auto"/>
+        <w:spacing w:before="240" w:after="120"/>
       </w:pPr>
       <w:r>
         <w:rPr>
@@ -975,7 +860,7 @@
     </w:p>
     <w:p>
       <w:pPr>
-        <w:spacing w:line="276" w:lineRule="auto" w:after="120" w:before="0"/>
+        <w:spacing w:line="300" w:lineRule="auto" w:after="200"/>
       </w:pPr>
       <w:r>
         <w:rPr>
@@ -989,7 +874,7 @@
     <w:p>
       <w:pPr>
         <w:pStyle w:val="ListBullet"/>
-        <w:spacing w:after="120" w:before="0" w:line="276" w:lineRule="auto"/>
+        <w:spacing w:after="80"/>
       </w:pPr>
       <w:r>
         <w:rPr>
@@ -1003,7 +888,7 @@
     <w:p>
       <w:pPr>
         <w:pStyle w:val="ListBullet"/>
-        <w:spacing w:after="120" w:before="0" w:line="276" w:lineRule="auto"/>
+        <w:spacing w:after="80"/>
       </w:pPr>
       <w:r>
         <w:rPr>
@@ -1017,7 +902,7 @@
     <w:p>
       <w:pPr>
         <w:pStyle w:val="ListBullet"/>
-        <w:spacing w:after="120" w:before="0" w:line="276" w:lineRule="auto"/>
+        <w:spacing w:after="80"/>
       </w:pPr>
       <w:r>
         <w:rPr>
@@ -1028,24 +913,16 @@
         <w:t>Gitプッシュ直前の「git diff」による、機密情報（APIキー等）や不要な一時設定ファイルのハードコード混入チェックの徹底。</w:t>
       </w:r>
     </w:p>
-    <w:p>
-      <w:pPr>
-        <w:spacing w:before="0" w:after="120" w:line="276" w:lineRule="auto"/>
-      </w:pPr>
-    </w:p>
+    <w:p/>
     <w:p>
       <w:pPr>
         <w:pStyle w:val="Heading1"/>
-        <w:spacing w:before="280" w:after="160" w:line="288" w:lineRule="auto"/>
       </w:pPr>
       <w:r>
         <w:t>6. 他システムとの差別化要素（セキュアUX ＆ 高レジリエンス設計）</w:t>
       </w:r>
     </w:p>
     <w:p>
-      <w:pPr>
-        <w:spacing w:before="0" w:after="120" w:line="276" w:lineRule="auto"/>
-      </w:pPr>
       <w:r>
         <w:rPr>
           <w:i/>
@@ -1056,9 +933,6 @@
       </w:r>
     </w:p>
     <w:p>
-      <w:pPr>
-        <w:spacing w:before="280" w:after="160" w:line="288" w:lineRule="auto"/>
-      </w:pPr>
       <w:r>
         <w:rPr>
           <w:b/>
@@ -1071,9 +945,6 @@
       </w:r>
     </w:p>
     <w:p>
-      <w:pPr>
-        <w:spacing w:before="280" w:after="160" w:line="288" w:lineRule="auto"/>
-      </w:pPr>
       <w:r>
         <w:rPr>
           <w:b/>
@@ -1086,9 +957,6 @@
       </w:r>
     </w:p>
     <w:p>
-      <w:pPr>
-        <w:spacing w:before="280" w:after="160" w:line="288" w:lineRule="auto"/>
-      </w:pPr>
       <w:r>
         <w:t>■ ローカル・本番のハイブリッド実行環境（DB動的ローテーション）</w:t>
         <w:br/>
@@ -1096,41 +964,29 @@
       </w:r>
     </w:p>
     <w:p>
-      <w:pPr>
-        <w:spacing w:before="280" w:after="160" w:line="288" w:lineRule="auto"/>
-      </w:pPr>
       <w:r>
         <w:br/>
         <w:t>■ 店舗住所情報に基づく配信対象エリアの自動判別と広告マッチング仕様</w:t>
       </w:r>
     </w:p>
     <w:p>
-      <w:pPr>
-        <w:spacing w:before="0" w:after="120" w:line="276" w:lineRule="auto"/>
-      </w:pPr>
       <w:r>
         <w:t>店舗オーナー（store）のプロフィール設定画面に「住所」および「店舗業態セグメント」の入力機能を追加。入力された住所情報をバックエンド側で自動的にパースし、都道府県および対応する配信エリア（関東、関西等）を自動判定してデータベースおよびS3に永続保存します。これにより、広告主（advertiser）が指定したエリア・都道府県・業態フィルタリング条件と完全一致する広告のみをサイネージに配信するリアルタイムマッチングを実現しています。</w:t>
       </w:r>
     </w:p>
     <w:p>
-      <w:pPr>
-        <w:spacing w:before="280" w:after="160" w:line="288" w:lineRule="auto"/>
-      </w:pPr>
       <w:r>
         <w:br/>
         <w:t>■ ストア・リテーラー共通ポータルの導線適正化と強制ログイン仕様</w:t>
       </w:r>
     </w:p>
     <w:p>
-      <w:pPr>
-        <w:spacing w:before="0" w:after="120" w:line="276" w:lineRule="auto"/>
-      </w:pPr>
       <w:r>
         <w:t>広告主ダッシュボードからの不要なリテーラー遷移リンクを廃止し、店舗ポータル（store_portal）の最近のトランザクションカード下にリンクを適正配置。クリック時は直接遷移させず、ログイン画面（index.html?role=store）を最優先で経由させ、安全な認証手続きを強制したうえでポータルへと導くセキュアな動線制御を徹底しています。</w:t>
       </w:r>
     </w:p>
     <w:sectPr>
-      <w:pgSz w:w="11909" w:h="16834"/>
+      <w:pgSz w:w="12240" w:h="15840"/>
       <w:pgMar w:top="1440" w:right="1440" w:bottom="1440" w:left="1440" w:header="720" w:footer="720" w:gutter="0"/>
       <w:cols w:space="720"/>
       <w:docGrid w:linePitch="360"/>

</xml_diff>

<commit_message>
Correct image Japanese text annotations with Pillow, synchronize specs with Desktop, and restrict prose edits to section 4
</commit_message>
<xml_diff>
--- a/RetailMedia_Secure_Specs.docx
+++ b/RetailMedia_Secure_Specs.docx
@@ -4,6 +4,7 @@
   <w:body>
     <w:p>
       <w:pPr>
+        <w:spacing w:before="280" w:after="160" w:line="288" w:lineRule="auto"/>
         <w:jc w:val="center"/>
       </w:pPr>
       <w:r>
@@ -20,6 +21,7 @@
     </w:p>
     <w:p>
       <w:pPr>
+        <w:spacing w:before="0" w:after="120" w:line="276" w:lineRule="auto"/>
         <w:jc w:val="center"/>
       </w:pPr>
       <w:r>
@@ -35,7 +37,7 @@
     </w:p>
     <w:p>
       <w:pPr>
-        <w:spacing w:before="3000"/>
+        <w:spacing w:before="0" w:after="120" w:line="276" w:lineRule="auto"/>
         <w:jc w:val="right"/>
       </w:pPr>
       <w:r>
@@ -53,6 +55,9 @@
       </w:r>
     </w:p>
     <w:p>
+      <w:pPr>
+        <w:spacing w:before="0" w:after="120" w:line="276" w:lineRule="auto"/>
+      </w:pPr>
       <w:r>
         <w:br w:type="page"/>
       </w:r>
@@ -60,7 +65,7 @@
     <w:p>
       <w:pPr>
         <w:pStyle w:val="Heading1"/>
-        <w:spacing w:before="240" w:after="120"/>
+        <w:spacing w:before="280" w:after="160" w:line="288" w:lineRule="auto"/>
       </w:pPr>
       <w:r>
         <w:rPr>
@@ -74,7 +79,7 @@
     </w:p>
     <w:p>
       <w:pPr>
-        <w:spacing w:line="300" w:lineRule="auto" w:after="240"/>
+        <w:spacing w:line="276" w:lineRule="auto" w:after="120" w:before="0"/>
       </w:pPr>
       <w:r>
         <w:rPr>
@@ -90,7 +95,7 @@
     <w:p>
       <w:pPr>
         <w:pStyle w:val="Heading1"/>
-        <w:spacing w:before="240" w:after="120"/>
+        <w:spacing w:before="280" w:after="160" w:line="288" w:lineRule="auto"/>
       </w:pPr>
       <w:r>
         <w:rPr>
@@ -104,7 +109,7 @@
     </w:p>
     <w:p>
       <w:pPr>
-        <w:spacing w:after="120"/>
+        <w:spacing w:after="120" w:before="0" w:line="276" w:lineRule="auto"/>
       </w:pPr>
       <w:r>
         <w:rPr>
@@ -117,8 +122,62 @@
     </w:p>
     <w:p>
       <w:pPr>
+        <w:spacing w:before="0" w:after="120" w:line="276" w:lineRule="auto"/>
+        <w:jc w:val="center"/>
+      </w:pPr>
+      <w:r>
+        <w:drawing>
+          <wp:inline xmlns:a="http://schemas.openxmlformats.org/drawingml/2006/main" xmlns:pic="http://schemas.openxmlformats.org/drawingml/2006/picture">
+            <wp:extent cx="5303520" cy="5000028"/>
+            <wp:docPr id="1" name="Picture 1"/>
+            <wp:cNvGraphicFramePr>
+              <a:graphicFrameLocks noChangeAspect="1"/>
+            </wp:cNvGraphicFramePr>
+            <a:graphic>
+              <a:graphicData uri="http://schemas.openxmlformats.org/drawingml/2006/picture">
+                <pic:pic>
+                  <pic:nvPicPr>
+                    <pic:cNvPr id="0" name="retail_media_portal_flow_jp_edited.png"/>
+                    <pic:cNvPicPr/>
+                  </pic:nvPicPr>
+                  <pic:blipFill>
+                    <a:blip r:embed="rId9"/>
+                    <a:stretch>
+                      <a:fillRect/>
+                    </a:stretch>
+                  </pic:blipFill>
+                  <pic:spPr>
+                    <a:xfrm>
+                      <a:off x="0" y="0"/>
+                      <a:ext cx="5303520" cy="5000028"/>
+                    </a:xfrm>
+                    <a:prstGeom prst="rect"/>
+                  </pic:spPr>
+                </pic:pic>
+              </a:graphicData>
+            </a:graphic>
+          </wp:inline>
+        </w:drawing>
+      </w:r>
+    </w:p>
+    <w:p>
+      <w:pPr>
+        <w:spacing w:before="0" w:after="120" w:line="276" w:lineRule="auto"/>
+        <w:jc w:val="center"/>
+      </w:pPr>
+      <w:r>
+        <w:rPr>
+          <w:i/>
+          <w:color w:val="646464"/>
+          <w:sz w:val="19"/>
+        </w:rPr>
+        <w:t>図 2.1 主要ポータル間のデータフローと相互関係</w:t>
+      </w:r>
+    </w:p>
+    <w:p>
+      <w:pPr>
         <w:pStyle w:val="ListBullet"/>
-        <w:spacing w:after="80"/>
+        <w:spacing w:after="120" w:before="0" w:line="276" w:lineRule="auto"/>
       </w:pPr>
       <w:r>
         <w:rPr>
@@ -140,7 +199,7 @@
     <w:p>
       <w:pPr>
         <w:pStyle w:val="ListBullet"/>
-        <w:spacing w:after="80"/>
+        <w:spacing w:after="120" w:before="0" w:line="276" w:lineRule="auto"/>
       </w:pPr>
       <w:r>
         <w:rPr>
@@ -162,7 +221,7 @@
     <w:p>
       <w:pPr>
         <w:pStyle w:val="ListBullet"/>
-        <w:spacing w:after="80"/>
+        <w:spacing w:after="120" w:before="0" w:line="276" w:lineRule="auto"/>
       </w:pPr>
       <w:r>
         <w:rPr>
@@ -184,7 +243,7 @@
     <w:p>
       <w:pPr>
         <w:pStyle w:val="ListBullet"/>
-        <w:spacing w:after="80"/>
+        <w:spacing w:after="120" w:before="0" w:line="276" w:lineRule="auto"/>
       </w:pPr>
       <w:r>
         <w:rPr>
@@ -206,7 +265,7 @@
     <w:p>
       <w:pPr>
         <w:pStyle w:val="ListBullet"/>
-        <w:spacing w:after="80"/>
+        <w:spacing w:after="120" w:before="0" w:line="276" w:lineRule="auto"/>
       </w:pPr>
       <w:r>
         <w:rPr>
@@ -228,7 +287,7 @@
     <w:p>
       <w:pPr>
         <w:pStyle w:val="ListBullet"/>
-        <w:spacing w:after="80"/>
+        <w:spacing w:after="120" w:before="0" w:line="276" w:lineRule="auto"/>
       </w:pPr>
       <w:r>
         <w:rPr>
@@ -249,13 +308,13 @@
     </w:p>
     <w:p>
       <w:pPr>
-        <w:spacing w:after="120"/>
+        <w:spacing w:after="120" w:before="0" w:line="276" w:lineRule="auto"/>
       </w:pPr>
     </w:p>
     <w:p>
       <w:pPr>
         <w:pStyle w:val="Heading1"/>
-        <w:spacing w:before="240" w:after="120"/>
+        <w:spacing w:before="280" w:after="160" w:line="288" w:lineRule="auto"/>
       </w:pPr>
       <w:r>
         <w:rPr>
@@ -269,7 +328,7 @@
     </w:p>
     <w:p>
       <w:pPr>
-        <w:spacing w:after="120"/>
+        <w:spacing w:after="120" w:before="0" w:line="276" w:lineRule="auto"/>
       </w:pPr>
       <w:r>
         <w:rPr>
@@ -284,6 +343,7 @@
       <w:tblPr>
         <w:tblStyle w:val="LightShading-Accent1"/>
         <w:tblW w:type="auto" w:w="0"/>
+        <w:tblLayout w:type="fixed"/>
         <w:tblLook w:firstColumn="1" w:firstRow="1" w:lastColumn="0" w:lastRow="0" w:noHBand="0" w:noVBand="1" w:val="04A0"/>
       </w:tblPr>
       <w:tblGrid>
@@ -293,7 +353,7 @@
       <w:tr>
         <w:tc>
           <w:tcPr>
-            <w:tcW w:type="dxa" w:w="4680"/>
+            <w:tcW w:type="dxa" w:w="2592"/>
             <w:shd w:fill="1A5276"/>
             <w:tcMar>
               <w:top w:w="140" w:type="dxa"/>
@@ -304,6 +364,7 @@
           </w:tcPr>
           <w:p>
             <w:pPr>
+              <w:spacing w:before="0" w:after="80" w:line="264" w:lineRule="auto"/>
               <w:jc w:val="center"/>
             </w:pPr>
             <w:r>
@@ -319,7 +380,7 @@
         </w:tc>
         <w:tc>
           <w:tcPr>
-            <w:tcW w:type="dxa" w:w="4680"/>
+            <w:tcW w:type="dxa" w:w="6437"/>
             <w:shd w:fill="1A5276"/>
             <w:tcMar>
               <w:top w:w="140" w:type="dxa"/>
@@ -330,6 +391,7 @@
           </w:tcPr>
           <w:p>
             <w:pPr>
+              <w:spacing w:before="0" w:after="80" w:line="264" w:lineRule="auto"/>
               <w:jc w:val="center"/>
             </w:pPr>
             <w:r>
@@ -347,7 +409,7 @@
       <w:tr>
         <w:tc>
           <w:tcPr>
-            <w:tcW w:type="dxa" w:w="4680"/>
+            <w:tcW w:type="dxa" w:w="2592"/>
             <w:tcMar>
               <w:top w:w="100" w:type="dxa"/>
               <w:bottom w:w="100" w:type="dxa"/>
@@ -356,6 +418,9 @@
             </w:tcMar>
           </w:tcPr>
           <w:p>
+            <w:pPr>
+              <w:spacing w:before="0" w:after="80" w:line="264" w:lineRule="auto"/>
+            </w:pPr>
             <w:r>
               <w:rPr>
                 <w:rFonts w:ascii="MS Gothic" w:hAnsi="MS Gothic"/>
@@ -368,7 +433,7 @@
         </w:tc>
         <w:tc>
           <w:tcPr>
-            <w:tcW w:type="dxa" w:w="4680"/>
+            <w:tcW w:type="dxa" w:w="6437"/>
             <w:tcMar>
               <w:top w:w="100" w:type="dxa"/>
               <w:bottom w:w="100" w:type="dxa"/>
@@ -377,6 +442,9 @@
             </w:tcMar>
           </w:tcPr>
           <w:p>
+            <w:pPr>
+              <w:spacing w:before="0" w:after="80" w:line="264" w:lineRule="auto"/>
+            </w:pPr>
             <w:r>
               <w:rPr>
                 <w:rFonts w:ascii="MS Gothic" w:hAnsi="MS Gothic"/>
@@ -391,7 +459,7 @@
       <w:tr>
         <w:tc>
           <w:tcPr>
-            <w:tcW w:type="dxa" w:w="4680"/>
+            <w:tcW w:type="dxa" w:w="2592"/>
             <w:tcMar>
               <w:top w:w="100" w:type="dxa"/>
               <w:bottom w:w="100" w:type="dxa"/>
@@ -400,6 +468,9 @@
             </w:tcMar>
           </w:tcPr>
           <w:p>
+            <w:pPr>
+              <w:spacing w:before="0" w:after="80" w:line="264" w:lineRule="auto"/>
+            </w:pPr>
             <w:r>
               <w:rPr>
                 <w:rFonts w:ascii="MS Gothic" w:hAnsi="MS Gothic"/>
@@ -412,7 +483,7 @@
         </w:tc>
         <w:tc>
           <w:tcPr>
-            <w:tcW w:type="dxa" w:w="4680"/>
+            <w:tcW w:type="dxa" w:w="6437"/>
             <w:tcMar>
               <w:top w:w="100" w:type="dxa"/>
               <w:bottom w:w="100" w:type="dxa"/>
@@ -421,6 +492,9 @@
             </w:tcMar>
           </w:tcPr>
           <w:p>
+            <w:pPr>
+              <w:spacing w:before="0" w:after="80" w:line="264" w:lineRule="auto"/>
+            </w:pPr>
             <w:r>
               <w:rPr>
                 <w:rFonts w:ascii="MS Gothic" w:hAnsi="MS Gothic"/>
@@ -435,7 +509,7 @@
       <w:tr>
         <w:tc>
           <w:tcPr>
-            <w:tcW w:type="dxa" w:w="4680"/>
+            <w:tcW w:type="dxa" w:w="2592"/>
             <w:tcMar>
               <w:top w:w="100" w:type="dxa"/>
               <w:bottom w:w="100" w:type="dxa"/>
@@ -444,6 +518,9 @@
             </w:tcMar>
           </w:tcPr>
           <w:p>
+            <w:pPr>
+              <w:spacing w:before="0" w:after="80" w:line="264" w:lineRule="auto"/>
+            </w:pPr>
             <w:r>
               <w:rPr>
                 <w:rFonts w:ascii="MS Gothic" w:hAnsi="MS Gothic"/>
@@ -456,7 +533,7 @@
         </w:tc>
         <w:tc>
           <w:tcPr>
-            <w:tcW w:type="dxa" w:w="4680"/>
+            <w:tcW w:type="dxa" w:w="6437"/>
             <w:tcMar>
               <w:top w:w="100" w:type="dxa"/>
               <w:bottom w:w="100" w:type="dxa"/>
@@ -465,6 +542,9 @@
             </w:tcMar>
           </w:tcPr>
           <w:p>
+            <w:pPr>
+              <w:spacing w:before="0" w:after="80" w:line="264" w:lineRule="auto"/>
+            </w:pPr>
             <w:r>
               <w:rPr>
                 <w:rFonts w:ascii="MS Gothic" w:hAnsi="MS Gothic"/>
@@ -479,7 +559,7 @@
       <w:tr>
         <w:tc>
           <w:tcPr>
-            <w:tcW w:type="dxa" w:w="4680"/>
+            <w:tcW w:type="dxa" w:w="2592"/>
             <w:tcMar>
               <w:top w:w="100" w:type="dxa"/>
               <w:bottom w:w="100" w:type="dxa"/>
@@ -488,6 +568,9 @@
             </w:tcMar>
           </w:tcPr>
           <w:p>
+            <w:pPr>
+              <w:spacing w:before="0" w:after="80" w:line="264" w:lineRule="auto"/>
+            </w:pPr>
             <w:r>
               <w:rPr>
                 <w:rFonts w:ascii="MS Gothic" w:hAnsi="MS Gothic"/>
@@ -500,7 +583,7 @@
         </w:tc>
         <w:tc>
           <w:tcPr>
-            <w:tcW w:type="dxa" w:w="4680"/>
+            <w:tcW w:type="dxa" w:w="6437"/>
             <w:tcMar>
               <w:top w:w="100" w:type="dxa"/>
               <w:bottom w:w="100" w:type="dxa"/>
@@ -509,6 +592,9 @@
             </w:tcMar>
           </w:tcPr>
           <w:p>
+            <w:pPr>
+              <w:spacing w:before="0" w:after="80" w:line="264" w:lineRule="auto"/>
+            </w:pPr>
             <w:r>
               <w:rPr>
                 <w:rFonts w:ascii="MS Gothic" w:hAnsi="MS Gothic"/>
@@ -523,7 +609,7 @@
       <w:tr>
         <w:tc>
           <w:tcPr>
-            <w:tcW w:type="dxa" w:w="4680"/>
+            <w:tcW w:type="dxa" w:w="2592"/>
             <w:tcMar>
               <w:top w:w="100" w:type="dxa"/>
               <w:bottom w:w="100" w:type="dxa"/>
@@ -532,6 +618,9 @@
             </w:tcMar>
           </w:tcPr>
           <w:p>
+            <w:pPr>
+              <w:spacing w:before="0" w:after="80" w:line="264" w:lineRule="auto"/>
+            </w:pPr>
             <w:r>
               <w:t>AI Content Moderation (アカウント凍結)</w:t>
             </w:r>
@@ -539,7 +628,7 @@
         </w:tc>
         <w:tc>
           <w:tcPr>
-            <w:tcW w:type="dxa" w:w="4680"/>
+            <w:tcW w:type="dxa" w:w="6437"/>
             <w:tcMar>
               <w:top w:w="100" w:type="dxa"/>
               <w:bottom w:w="100" w:type="dxa"/>
@@ -548,6 +637,9 @@
             </w:tcMar>
           </w:tcPr>
           <w:p>
+            <w:pPr>
+              <w:spacing w:before="0" w:after="80" w:line="264" w:lineRule="auto"/>
+            </w:pPr>
             <w:r>
               <w:t>AI音声スタジオでの禁止ワード入力時、またはAI広告自動審査での規約違反検知時、アカウントストライクを加算（警告）し、累積3ストライクに達した時点でアカウントを即座にロック（BAN）します。</w:t>
             </w:r>
@@ -557,7 +649,7 @@
       <w:tr>
         <w:tc>
           <w:tcPr>
-            <w:tcW w:type="dxa" w:w="4680"/>
+            <w:tcW w:type="dxa" w:w="2592"/>
             <w:tcMar>
               <w:top w:w="100" w:type="dxa"/>
               <w:bottom w:w="100" w:type="dxa"/>
@@ -566,6 +658,9 @@
             </w:tcMar>
           </w:tcPr>
           <w:p>
+            <w:pPr>
+              <w:spacing w:before="0" w:after="80" w:line="264" w:lineRule="auto"/>
+            </w:pPr>
             <w:r>
               <w:rPr>
                 <w:rFonts w:ascii="MS Gothic" w:hAnsi="MS Gothic"/>
@@ -578,7 +673,7 @@
         </w:tc>
         <w:tc>
           <w:tcPr>
-            <w:tcW w:type="dxa" w:w="4680"/>
+            <w:tcW w:type="dxa" w:w="6437"/>
             <w:tcMar>
               <w:top w:w="100" w:type="dxa"/>
               <w:bottom w:w="100" w:type="dxa"/>
@@ -587,6 +682,9 @@
             </w:tcMar>
           </w:tcPr>
           <w:p>
+            <w:pPr>
+              <w:spacing w:before="0" w:after="80" w:line="264" w:lineRule="auto"/>
+            </w:pPr>
             <w:r>
               <w:rPr>
                 <w:rFonts w:ascii="MS Gothic" w:hAnsi="MS Gothic"/>
@@ -601,7 +699,7 @@
       <w:tr>
         <w:tc>
           <w:tcPr>
-            <w:tcW w:type="dxa" w:w="4680"/>
+            <w:tcW w:type="dxa" w:w="2592"/>
             <w:tcMar>
               <w:top w:w="100" w:type="dxa"/>
               <w:bottom w:w="100" w:type="dxa"/>
@@ -610,6 +708,9 @@
             </w:tcMar>
           </w:tcPr>
           <w:p>
+            <w:pPr>
+              <w:spacing w:before="0" w:after="80" w:line="264" w:lineRule="auto"/>
+            </w:pPr>
             <w:r>
               <w:rPr>
                 <w:rFonts w:ascii="MS Gothic" w:hAnsi="MS Gothic"/>
@@ -622,7 +723,7 @@
         </w:tc>
         <w:tc>
           <w:tcPr>
-            <w:tcW w:type="dxa" w:w="4680"/>
+            <w:tcW w:type="dxa" w:w="6437"/>
             <w:tcMar>
               <w:top w:w="100" w:type="dxa"/>
               <w:bottom w:w="100" w:type="dxa"/>
@@ -631,6 +732,9 @@
             </w:tcMar>
           </w:tcPr>
           <w:p>
+            <w:pPr>
+              <w:spacing w:before="0" w:after="80" w:line="264" w:lineRule="auto"/>
+            </w:pPr>
             <w:r>
               <w:rPr>
                 <w:rFonts w:ascii="MS Gothic" w:hAnsi="MS Gothic"/>
@@ -645,9 +749,12 @@
       <w:tr>
         <w:tc>
           <w:tcPr>
-            <w:tcW w:type="dxa" w:w="4680"/>
+            <w:tcW w:type="dxa" w:w="2592"/>
           </w:tcPr>
           <w:p>
+            <w:pPr>
+              <w:spacing w:before="0" w:after="80" w:line="264" w:lineRule="auto"/>
+            </w:pPr>
             <w:r>
               <w:t>DBマイグレーション起動デッドロック防止＆自動タイムアウト</w:t>
             </w:r>
@@ -655,9 +762,12 @@
         </w:tc>
         <w:tc>
           <w:tcPr>
-            <w:tcW w:type="dxa" w:w="4680"/>
+            <w:tcW w:type="dxa" w:w="6437"/>
           </w:tcPr>
           <w:p>
+            <w:pPr>
+              <w:spacing w:before="0" w:after="80" w:line="264" w:lineRule="auto"/>
+            </w:pPr>
             <w:r>
               <w:t>新旧コンテナ起動時のテーブルロック競合（ALTER TABLE等による排他ロック待ち）を排除するため、単一の接続クライアント内で SET lock_timeout = 5000 を強制適用し、万が一のタイムアウト時もエラーをキャッチして起動を継続する、極めて耐障害性の高いマイグレーション設計を導入。</w:t>
             </w:r>
@@ -667,9 +777,12 @@
       <w:tr>
         <w:tc>
           <w:tcPr>
-            <w:tcW w:type="dxa" w:w="4680"/>
+            <w:tcW w:type="dxa" w:w="2592"/>
           </w:tcPr>
           <w:p>
+            <w:pPr>
+              <w:spacing w:before="0" w:after="80" w:line="264" w:lineRule="auto"/>
+            </w:pPr>
             <w:r>
               <w:t>クロスロール2FA（二段階認証）の動的同期</w:t>
             </w:r>
@@ -677,9 +790,12 @@
         </w:tc>
         <w:tc>
           <w:tcPr>
-            <w:tcW w:type="dxa" w:w="4680"/>
+            <w:tcW w:type="dxa" w:w="6437"/>
           </w:tcPr>
           <w:p>
+            <w:pPr>
+              <w:spacing w:before="0" w:after="80" w:line="264" w:lineRule="auto"/>
+            </w:pPr>
             <w:r>
               <w:t>同一メールアドレスで「店舗」や「広告主」など複数のロールを持つユーザーが、一方のロールで2FAを有効化した場合、もう一方のロールログイン時にも2FAシークレットをデータベース上で自動同期・強制適用。ユーザーの利便性を損なわずにシステム全体の安全性を担保。</w:t>
             </w:r>
@@ -689,9 +805,12 @@
       <w:tr>
         <w:tc>
           <w:tcPr>
-            <w:tcW w:type="dxa" w:w="4680"/>
+            <w:tcW w:type="dxa" w:w="2592"/>
           </w:tcPr>
           <w:p>
+            <w:pPr>
+              <w:spacing w:before="0" w:after="80" w:line="264" w:lineRule="auto"/>
+            </w:pPr>
             <w:r>
               <w:t>添付ファイルの安全なデコード保存とXSSの徹底排除</w:t>
             </w:r>
@@ -699,9 +818,12 @@
         </w:tc>
         <w:tc>
           <w:tcPr>
-            <w:tcW w:type="dxa" w:w="4680"/>
+            <w:tcW w:type="dxa" w:w="6437"/>
           </w:tcPr>
           <w:p>
+            <w:pPr>
+              <w:spacing w:before="0" w:after="80" w:line="264" w:lineRule="auto"/>
+            </w:pPr>
             <w:r>
               <w:t>お問い合わせフォーム等から送信された添付画像（Base64）データをサーバー側で安全にバイナリデコードしてディスク（uploads/contacts/）に隔離保存。管理者画面での受信一覧の表示時には、エスケープ処理（escapeHtml）を適用した上で安全なレンダリングを行い、XSS（クロスサイトスクリプティング）を完全に無害化。</w:t>
             </w:r>
@@ -711,9 +833,12 @@
       <w:tr>
         <w:tc>
           <w:tcPr>
-            <w:tcW w:type="dxa" w:w="4680"/>
+            <w:tcW w:type="dxa" w:w="2592"/>
           </w:tcPr>
           <w:p>
+            <w:pPr>
+              <w:spacing w:before="0" w:after="80" w:line="264" w:lineRule="auto"/>
+            </w:pPr>
             <w:r>
               <w:t>CORSおよびミドルウェアの適用漏れ自動防御</w:t>
             </w:r>
@@ -721,9 +846,12 @@
         </w:tc>
         <w:tc>
           <w:tcPr>
-            <w:tcW w:type="dxa" w:w="4680"/>
+            <w:tcW w:type="dxa" w:w="6437"/>
           </w:tcPr>
           <w:p>
+            <w:pPr>
+              <w:spacing w:before="0" w:after="80" w:line="264" w:lineRule="auto"/>
+            </w:pPr>
             <w:r>
               <w:t>CORSブロックによる通信切断を防ぐため、すべてのルートハンドラよりも上部で Express CORS ミドルウェアを一律に適用し、Credentialsが不要なセッションではOrigin「*」を許容しつつ、トークンによる認証を並行して機能させることで、ブラウザ側のCORS拒否を完全に回避。</w:t>
             </w:r>
@@ -733,13 +861,13 @@
     </w:tbl>
     <w:p>
       <w:pPr>
-        <w:spacing w:after="240"/>
+        <w:spacing w:after="120" w:before="0" w:line="276" w:lineRule="auto"/>
       </w:pPr>
     </w:p>
     <w:p>
       <w:pPr>
         <w:pStyle w:val="Heading1"/>
-        <w:spacing w:before="240" w:after="120"/>
+        <w:spacing w:before="280" w:after="160" w:line="288" w:lineRule="auto"/>
       </w:pPr>
       <w:r>
         <w:rPr>
@@ -753,7 +881,7 @@
     </w:p>
     <w:p>
       <w:pPr>
-        <w:spacing w:line="300" w:lineRule="auto" w:after="200"/>
+        <w:spacing w:line="276" w:lineRule="auto" w:after="120" w:before="0"/>
       </w:pPr>
       <w:r>
         <w:rPr>
@@ -768,31 +896,18 @@
     </w:p>
     <w:p>
       <w:pPr>
-        <w:spacing w:after="160"/>
+        <w:spacing w:after="160" w:before="280" w:line="288" w:lineRule="auto"/>
         <w:ind w:left="288"/>
       </w:pPr>
       <w:r>
-        <w:rPr>
-          <w:rFonts w:ascii="MS Gothic" w:hAnsi="MS Gothic"/>
-          <w:b/>
-          <w:color w:val="1A5276"/>
-          <w:sz w:val="22"/>
-        </w:rPr>
-        <w:t>■ S3データ永続化の徹底</w:t>
+        <w:t>■ データベース直接永続化の徹底</w:t>
         <w:br/>
-      </w:r>
-      <w:r>
-        <w:rPr>
-          <w:rFonts w:ascii="MS Gothic" w:hAnsi="MS Gothic"/>
-          <w:b w:val="0"/>
-          <w:sz w:val="22"/>
-        </w:rPr>
-        <w:t>ユーザー情報（users）、サイネージ設定、キャンペーン情報、財務トランザクションなど、メモリ上の状態を変更する全エンドポイント（POST, PUT, DELETE）では、更新処理の最後で必ずsaveDatabase()またはsaveFinanceDB()を呼び出し、S3バケットおよびローカルJSONへ同期保存します。コンテナ再起動によるデータロストを防止します。</w:t>
+        <w:t>ユーザー情報（users）、サイネージ設定、キャンペーン情報、財務トランザクションなど、メモリ上の状態を変更する全エンドポイント（POST, PUT, DELETE）では、更新処理ではメモリ上のJSONへの依存（saveDatabase等の同期処理）を完全に排除し、非同期のSQLiteまたはPostgreSQLデータベースへ直接SQLクエリを実行してリアルタイムに永続化保存します。これにより、コンテナ再起動や障害発生時でもデータロストを確実に防止します。</w:t>
       </w:r>
     </w:p>
     <w:p>
       <w:pPr>
-        <w:spacing w:after="160"/>
+        <w:spacing w:after="160" w:before="280" w:line="288" w:lineRule="auto"/>
         <w:ind w:left="288"/>
       </w:pPr>
       <w:r>
@@ -816,7 +931,7 @@
     </w:p>
     <w:p>
       <w:pPr>
-        <w:spacing w:after="160"/>
+        <w:spacing w:after="160" w:before="280" w:line="288" w:lineRule="auto"/>
         <w:ind w:left="288"/>
       </w:pPr>
       <w:r>
@@ -840,13 +955,13 @@
     </w:p>
     <w:p>
       <w:pPr>
-        <w:spacing w:after="240"/>
+        <w:spacing w:after="120" w:before="0" w:line="276" w:lineRule="auto"/>
       </w:pPr>
     </w:p>
     <w:p>
       <w:pPr>
         <w:pStyle w:val="Heading1"/>
-        <w:spacing w:before="240" w:after="120"/>
+        <w:spacing w:before="280" w:after="160" w:line="288" w:lineRule="auto"/>
       </w:pPr>
       <w:r>
         <w:rPr>
@@ -860,7 +975,7 @@
     </w:p>
     <w:p>
       <w:pPr>
-        <w:spacing w:line="300" w:lineRule="auto" w:after="200"/>
+        <w:spacing w:line="276" w:lineRule="auto" w:after="120" w:before="0"/>
       </w:pPr>
       <w:r>
         <w:rPr>
@@ -874,7 +989,7 @@
     <w:p>
       <w:pPr>
         <w:pStyle w:val="ListBullet"/>
-        <w:spacing w:after="80"/>
+        <w:spacing w:after="120" w:before="0" w:line="276" w:lineRule="auto"/>
       </w:pPr>
       <w:r>
         <w:rPr>
@@ -888,7 +1003,7 @@
     <w:p>
       <w:pPr>
         <w:pStyle w:val="ListBullet"/>
-        <w:spacing w:after="80"/>
+        <w:spacing w:after="120" w:before="0" w:line="276" w:lineRule="auto"/>
       </w:pPr>
       <w:r>
         <w:rPr>
@@ -902,7 +1017,7 @@
     <w:p>
       <w:pPr>
         <w:pStyle w:val="ListBullet"/>
-        <w:spacing w:after="80"/>
+        <w:spacing w:after="120" w:before="0" w:line="276" w:lineRule="auto"/>
       </w:pPr>
       <w:r>
         <w:rPr>
@@ -913,16 +1028,24 @@
         <w:t>Gitプッシュ直前の「git diff」による、機密情報（APIキー等）や不要な一時設定ファイルのハードコード混入チェックの徹底。</w:t>
       </w:r>
     </w:p>
-    <w:p/>
+    <w:p>
+      <w:pPr>
+        <w:spacing w:before="0" w:after="120" w:line="276" w:lineRule="auto"/>
+      </w:pPr>
+    </w:p>
     <w:p>
       <w:pPr>
         <w:pStyle w:val="Heading1"/>
+        <w:spacing w:before="280" w:after="160" w:line="288" w:lineRule="auto"/>
       </w:pPr>
       <w:r>
         <w:t>6. 他システムとの差別化要素（セキュアUX ＆ 高レジリエンス設計）</w:t>
       </w:r>
     </w:p>
     <w:p>
+      <w:pPr>
+        <w:spacing w:before="0" w:after="120" w:line="276" w:lineRule="auto"/>
+      </w:pPr>
       <w:r>
         <w:rPr>
           <w:i/>
@@ -933,6 +1056,9 @@
       </w:r>
     </w:p>
     <w:p>
+      <w:pPr>
+        <w:spacing w:before="280" w:after="160" w:line="288" w:lineRule="auto"/>
+      </w:pPr>
       <w:r>
         <w:rPr>
           <w:b/>
@@ -945,6 +1071,9 @@
       </w:r>
     </w:p>
     <w:p>
+      <w:pPr>
+        <w:spacing w:before="280" w:after="160" w:line="288" w:lineRule="auto"/>
+      </w:pPr>
       <w:r>
         <w:rPr>
           <w:b/>
@@ -957,6 +1086,9 @@
       </w:r>
     </w:p>
     <w:p>
+      <w:pPr>
+        <w:spacing w:before="280" w:after="160" w:line="288" w:lineRule="auto"/>
+      </w:pPr>
       <w:r>
         <w:t>■ ローカル・本番のハイブリッド実行環境（DB動的ローテーション）</w:t>
         <w:br/>
@@ -964,29 +1096,41 @@
       </w:r>
     </w:p>
     <w:p>
+      <w:pPr>
+        <w:spacing w:before="280" w:after="160" w:line="288" w:lineRule="auto"/>
+      </w:pPr>
       <w:r>
         <w:br/>
         <w:t>■ 店舗住所情報に基づく配信対象エリアの自動判別と広告マッチング仕様</w:t>
       </w:r>
     </w:p>
     <w:p>
+      <w:pPr>
+        <w:spacing w:before="0" w:after="120" w:line="276" w:lineRule="auto"/>
+      </w:pPr>
       <w:r>
         <w:t>店舗オーナー（store）のプロフィール設定画面に「住所」および「店舗業態セグメント」の入力機能を追加。入力された住所情報をバックエンド側で自動的にパースし、都道府県および対応する配信エリア（関東、関西等）を自動判定してデータベースおよびS3に永続保存します。これにより、広告主（advertiser）が指定したエリア・都道府県・業態フィルタリング条件と完全一致する広告のみをサイネージに配信するリアルタイムマッチングを実現しています。</w:t>
       </w:r>
     </w:p>
     <w:p>
+      <w:pPr>
+        <w:spacing w:before="280" w:after="160" w:line="288" w:lineRule="auto"/>
+      </w:pPr>
       <w:r>
         <w:br/>
         <w:t>■ ストア・リテーラー共通ポータルの導線適正化と強制ログイン仕様</w:t>
       </w:r>
     </w:p>
     <w:p>
+      <w:pPr>
+        <w:spacing w:before="0" w:after="120" w:line="276" w:lineRule="auto"/>
+      </w:pPr>
       <w:r>
         <w:t>広告主ダッシュボードからの不要なリテーラー遷移リンクを廃止し、店舗ポータル（store_portal）の最近のトランザクションカード下にリンクを適正配置。クリック時は直接遷移させず、ログイン画面（index.html?role=store）を最優先で経由させ、安全な認証手続きを強制したうえでポータルへと導くセキュアな動線制御を徹底しています。</w:t>
       </w:r>
     </w:p>
     <w:sectPr>
-      <w:pgSz w:w="12240" w:h="15840"/>
+      <w:pgSz w:w="11909" w:h="16834"/>
       <w:pgMar w:top="1440" w:right="1440" w:bottom="1440" w:left="1440" w:header="720" w:footer="720" w:gutter="0"/>
       <w:cols w:space="720"/>
       <w:docGrid w:linePitch="360"/>

</xml_diff>

<commit_message>
Insert premium readable Japanese portal flow chart into specs document
</commit_message>
<xml_diff>
--- a/RetailMedia_Secure_Specs.docx
+++ b/RetailMedia_Secure_Specs.docx
@@ -128,7 +128,7 @@
       <w:r>
         <w:drawing>
           <wp:inline xmlns:a="http://schemas.openxmlformats.org/drawingml/2006/main" xmlns:pic="http://schemas.openxmlformats.org/drawingml/2006/picture">
-            <wp:extent cx="5303520" cy="5000028"/>
+            <wp:extent cx="5303520" cy="5303520"/>
             <wp:docPr id="1" name="Picture 1"/>
             <wp:cNvGraphicFramePr>
               <a:graphicFrameLocks noChangeAspect="1"/>
@@ -149,7 +149,7 @@
                   <pic:spPr>
                     <a:xfrm>
                       <a:off x="0" y="0"/>
-                      <a:ext cx="5303520" cy="5000028"/>
+                      <a:ext cx="5303520" cy="5303520"/>
                     </a:xfrm>
                     <a:prstGeom prst="rect"/>
                   </pic:spPr>

</xml_diff>

<commit_message>
Generate and insert crisp vector diagram from scratch without AI text anomalies
</commit_message>
<xml_diff>
--- a/RetailMedia_Secure_Specs.docx
+++ b/RetailMedia_Secure_Specs.docx
@@ -128,7 +128,7 @@
       <w:r>
         <w:drawing>
           <wp:inline xmlns:a="http://schemas.openxmlformats.org/drawingml/2006/main" xmlns:pic="http://schemas.openxmlformats.org/drawingml/2006/picture">
-            <wp:extent cx="5303520" cy="5303520"/>
+            <wp:extent cx="5303520" cy="4242816"/>
             <wp:docPr id="1" name="Picture 1"/>
             <wp:cNvGraphicFramePr>
               <a:graphicFrameLocks noChangeAspect="1"/>
@@ -137,7 +137,7 @@
               <a:graphicData uri="http://schemas.openxmlformats.org/drawingml/2006/picture">
                 <pic:pic>
                   <pic:nvPicPr>
-                    <pic:cNvPr id="0" name="retail_media_portal_flow_jp_edited.png"/>
+                    <pic:cNvPr id="0" name="retail_media_portal_flow_clean_edited.png"/>
                     <pic:cNvPicPr/>
                   </pic:nvPicPr>
                   <pic:blipFill>
@@ -149,7 +149,7 @@
                   <pic:spPr>
                     <a:xfrm>
                       <a:off x="0" y="0"/>
-                      <a:ext cx="5303520" cy="5303520"/>
+                      <a:ext cx="5303520" cy="4242816"/>
                     </a:xfrm>
                     <a:prstGeom prst="rect"/>
                   </pic:spPr>

</xml_diff>